<commit_message>
Trabajo de Juan Castillo ajustado a la norma: retención total (Res. 4095/2000), F29 código 39/596, DJ F3500, productos con código
Co-Authored-By: Claude Sonnet 5.5 <noreply@anthropic.com>
Claude-Session: https://claude.ai/code/session_012WV3i5CNskdg7dgJ6kwcHp
</commit_message>
<xml_diff>
--- a/trabajo_juan_castillo/cambio_sujeto_silvestres.docx
+++ b/trabajo_juan_castillo/cambio_sujeto_silvestres.docx
@@ -150,12 +150,12 @@
     </w:p>
     <w:p>
       <w:r>
-        <w:t>[ADJUNTAR AQUÍ LA RESOLUCIÓN DEL SII: Res. Ex. SII N° ____ de ____ ⚠️ completar]</w:t>
+        <w:t>[ADJUNTAR AQUÍ LA RESOLUCIÓN: Resolución Exenta SII N° 4095 del 25 de agosto de 2000 ⚠️ copiar el texto desde sii.cl]</w:t>
       </w:r>
     </w:p>
     <w:p>
       <w:r>
-        <w:t>Según los resúmenes consultados, los productos silvestres se rigen por las Res. Ex. SII N° 5776 de 1999 y N° 4095 de 2000 (rosa mosqueta, mora, hongos, boldo y otros). Falta copiar del sitio del SII la lista oficial de productos, quién debe retener y el porcentaje de retención vigente. En este ejemplo se usa retención total del IVA.</w:t>
+        <w:t>La Resolución Exenta N° 4095 de 2000 dispone el cambio de sujeto de derecho del IVA en las ventas de productos silvestres: el comprador debe emitir una factura de compra, retener el IVA y declararlo y pagarlo; el vendedor no está obligado a emitir factura por esa venta. La retención es total, es decir, el 100 % del IVA de la operación. Los productos incluyen rosa mosqueta, mora, hongos, frutos de espino, hojas de boldo, tilo, manzanilla, llantén, toronjil, cedrón, hierbas pectorales, romero, quillay, hierba de hipérico y cera de abeja. La Resolución Ex. N° 2 de 2018 mantiene vigente este régimen. ⚠️ Datos tomados de resúmenes de búsqueda: contrastar con el texto oficial del SII.</w:t>
       </w:r>
     </w:p>
     <w:p>
@@ -233,7 +233,7 @@
               </w:rPr>
               <w:t>Silvestres del Ñuble SpA (ficticia)</w:t>
               <w:br/>
-              <w:t>RUT 76.123.456-7</w:t>
+              <w:t>RUT 76.123.456-0</w:t>
               <w:br/>
               <w:t>Giro: Compra y venta de productos silvestres</w:t>
               <w:br/>
@@ -254,7 +254,7 @@
                 <w:rFonts w:ascii="Arial" w:hAnsi="Arial"/>
                 <w:sz w:val="20"/>
               </w:rPr>
-              <w:t>R.U.T.: 76.123.456-7</w:t>
+              <w:t>R.U.T.: 76.123.456-0</w:t>
               <w:br/>
               <w:t>FACTURA DE COMPRA ELECTRÓNICA</w:t>
               <w:br/>
@@ -454,6 +454,42 @@
                 <w:sz w:val="20"/>
               </w:rPr>
               <w:t>02-10-2026</w:t>
+            </w:r>
+          </w:p>
+        </w:tc>
+      </w:tr>
+      <w:tr>
+        <w:tc>
+          <w:tcPr>
+            <w:tcW w:type="dxa" w:w="4702"/>
+          </w:tcPr>
+          <w:p>
+            <w:pPr>
+              <w:spacing w:line="240" w:lineRule="auto"/>
+            </w:pPr>
+            <w:r>
+              <w:rPr>
+                <w:rFonts w:ascii="Arial" w:hAnsi="Arial"/>
+                <w:sz w:val="20"/>
+              </w:rPr>
+              <w:t>Código de producto (F3500)</w:t>
+            </w:r>
+          </w:p>
+        </w:tc>
+        <w:tc>
+          <w:tcPr>
+            <w:tcW w:type="dxa" w:w="4702"/>
+          </w:tcPr>
+          <w:p>
+            <w:pPr>
+              <w:spacing w:line="240" w:lineRule="auto"/>
+            </w:pPr>
+            <w:r>
+              <w:rPr>
+                <w:rFonts w:ascii="Arial" w:hAnsi="Arial"/>
+                <w:sz w:val="20"/>
+              </w:rPr>
+              <w:t>3101 Rosa mosqueta</w:t>
             </w:r>
           </w:p>
         </w:tc>
@@ -560,7 +596,7 @@
                 <w:rFonts w:ascii="Arial" w:hAnsi="Arial"/>
                 <w:sz w:val="20"/>
               </w:rPr>
-              <w:t>Rosa mosqueta seca</w:t>
+              <w:t>Rosa mosqueta</w:t>
             </w:r>
           </w:p>
         </w:tc>
@@ -751,7 +787,7 @@
                 <w:rFonts w:ascii="Arial" w:hAnsi="Arial"/>
                 <w:sz w:val="20"/>
               </w:rPr>
-              <w:t>IVA retenido (cambio de sujeto)</w:t>
+              <w:t>IVA retenido total (código 15)</w:t>
             </w:r>
           </w:p>
         </w:tc>
@@ -849,7 +885,7 @@
     <w:p/>
     <w:p>
       <w:r>
-        <w:t>Texto al pie: «Factura de compra por cambio de sujeto de IVA, Res. Ex. SII N° ____ ⚠️». La factura de venta de la empresa a sus clientes lleva el neto, el IVA 19 % y el total, como una factura normal (ejemplo: N° 101 a Exportadora Andes SpA, neto $1.900.000, IVA $361.000, total $2.261.000).</w:t>
+        <w:t>Texto al pie: «Factura de compra por cambio de sujeto de IVA, Res. Ex. SII N° 4095 de 2000». La factura de venta de la empresa a sus clientes lleva el neto, el IVA 19 % y el total, como una factura normal (ejemplo: N° 101 a Exportadora Andes SpA, neto $1.900.000, IVA $361.000, total $2.261.000).</w:t>
       </w:r>
     </w:p>
     <w:p>
@@ -1230,7 +1266,7 @@
                 <w:rFonts w:ascii="Arial" w:hAnsi="Arial"/>
                 <w:sz w:val="18"/>
               </w:rPr>
-              <w:t>12.222.222-2</w:t>
+              <w:t>12.222.222-5</w:t>
             </w:r>
           </w:p>
         </w:tc>
@@ -1368,7 +1404,7 @@
                 <w:rFonts w:ascii="Arial" w:hAnsi="Arial"/>
                 <w:sz w:val="18"/>
               </w:rPr>
-              <w:t>13.333.333-3</w:t>
+              <w:t>13.333.333-9</w:t>
             </w:r>
           </w:p>
         </w:tc>
@@ -1506,7 +1542,7 @@
                 <w:rFonts w:ascii="Arial" w:hAnsi="Arial"/>
                 <w:sz w:val="18"/>
               </w:rPr>
-              <w:t>14.444.444-4</w:t>
+              <w:t>14.444.444-2</w:t>
             </w:r>
           </w:p>
         </w:tc>
@@ -1644,7 +1680,7 @@
                 <w:rFonts w:ascii="Arial" w:hAnsi="Arial"/>
                 <w:sz w:val="18"/>
               </w:rPr>
-              <w:t>15.555.555-5</w:t>
+              <w:t>15.555.555-6</w:t>
             </w:r>
           </w:p>
         </w:tc>
@@ -2067,7 +2103,7 @@
                 <w:rFonts w:ascii="Arial" w:hAnsi="Arial"/>
                 <w:sz w:val="18"/>
               </w:rPr>
-              <w:t>76.200.100-1</w:t>
+              <w:t>76.200.100-4</w:t>
             </w:r>
           </w:p>
         </w:tc>
@@ -2188,7 +2224,7 @@
                 <w:rFonts w:ascii="Arial" w:hAnsi="Arial"/>
                 <w:sz w:val="18"/>
               </w:rPr>
-              <w:t>76.200.200-2</w:t>
+              <w:t>76.200.200-0</w:t>
             </w:r>
           </w:p>
         </w:tc>
@@ -2309,7 +2345,7 @@
                 <w:rFonts w:ascii="Arial" w:hAnsi="Arial"/>
                 <w:sz w:val="18"/>
               </w:rPr>
-              <w:t>76.200.300-3</w:t>
+              <w:t>76.200.300-7</w:t>
             </w:r>
           </w:p>
         </w:tc>
@@ -2430,7 +2466,7 @@
                 <w:rFonts w:ascii="Arial" w:hAnsi="Arial"/>
                 <w:sz w:val="18"/>
               </w:rPr>
-              <w:t>76.200.400-4</w:t>
+              <w:t>76.200.400-3</w:t>
             </w:r>
           </w:p>
         </w:tc>
@@ -2551,7 +2587,7 @@
                 <w:rFonts w:ascii="Arial" w:hAnsi="Arial"/>
                 <w:sz w:val="18"/>
               </w:rPr>
-              <w:t>76.200.500-5</w:t>
+              <w:t>76.200.500-K</w:t>
             </w:r>
           </w:p>
         </w:tc>
@@ -2888,7 +2924,7 @@
                 <w:rFonts w:ascii="Arial" w:hAnsi="Arial"/>
                 <w:sz w:val="16"/>
               </w:rPr>
-              <w:t>Factura de compra N°201: Rosa mosqueta seca (IVA retenido)</w:t>
+              <w:t>Factura de compra N°201: Rosa mosqueta (IVA retenido)</w:t>
             </w:r>
           </w:p>
         </w:tc>
@@ -3309,7 +3345,7 @@
                 <w:rFonts w:ascii="Arial" w:hAnsi="Arial"/>
                 <w:sz w:val="16"/>
               </w:rPr>
-              <w:t>Factura de compra N°202: Hongos silvestres (IVA retenido)</w:t>
+              <w:t>Factura de compra N°202: Hongos (IVA retenido)</w:t>
             </w:r>
           </w:p>
         </w:tc>
@@ -3730,7 +3766,7 @@
                 <w:rFonts w:ascii="Arial" w:hAnsi="Arial"/>
                 <w:sz w:val="16"/>
               </w:rPr>
-              <w:t>Factura de compra N°203: Mora silvestre (IVA retenido)</w:t>
+              <w:t>Factura de compra N°203: Mora (IVA retenido)</w:t>
             </w:r>
           </w:p>
         </w:tc>
@@ -4572,7 +4608,7 @@
                 <w:rFonts w:ascii="Arial" w:hAnsi="Arial"/>
                 <w:sz w:val="16"/>
               </w:rPr>
-              <w:t>Factura de compra N°205: Rosa mosqueta (IVA retenido)</w:t>
+              <w:t>Factura de compra N°205: Frutos de espino (IVA retenido)</w:t>
             </w:r>
           </w:p>
         </w:tc>
@@ -8176,7 +8212,7 @@
                 <w:rFonts w:ascii="Arial" w:hAnsi="Arial"/>
                 <w:sz w:val="18"/>
               </w:rPr>
-              <w:t>Reverso ⚠️</w:t>
+              <w:t>Reverso</w:t>
             </w:r>
           </w:p>
         </w:tc>
@@ -8193,7 +8229,7 @@
                 <w:rFonts w:ascii="Arial" w:hAnsi="Arial"/>
                 <w:sz w:val="18"/>
               </w:rPr>
-              <w:t>—</w:t>
+              <w:t>39</w:t>
             </w:r>
           </w:p>
         </w:tc>
@@ -8210,7 +8246,77 @@
                 <w:rFonts w:ascii="Arial" w:hAnsi="Arial"/>
                 <w:sz w:val="18"/>
               </w:rPr>
-              <w:t>IVA retenido por cambio de sujeto (retención total)</w:t>
+              <w:t>IVA retenido a terceros con retención total (línea 118 en las instrucciones de nov-2024) ⚠️</w:t>
+            </w:r>
+          </w:p>
+        </w:tc>
+        <w:tc>
+          <w:tcPr>
+            <w:tcW w:type="dxa" w:w="2351"/>
+          </w:tcPr>
+          <w:p>
+            <w:pPr>
+              <w:spacing w:line="240" w:lineRule="auto"/>
+            </w:pPr>
+            <w:r>
+              <w:rPr>
+                <w:rFonts w:ascii="Arial" w:hAnsi="Arial"/>
+                <w:sz w:val="18"/>
+              </w:rPr>
+              <w:t>1.073.500</w:t>
+            </w:r>
+          </w:p>
+        </w:tc>
+      </w:tr>
+      <w:tr>
+        <w:tc>
+          <w:tcPr>
+            <w:tcW w:type="dxa" w:w="2351"/>
+          </w:tcPr>
+          <w:p>
+            <w:pPr>
+              <w:spacing w:line="240" w:lineRule="auto"/>
+            </w:pPr>
+            <w:r>
+              <w:rPr>
+                <w:rFonts w:ascii="Arial" w:hAnsi="Arial"/>
+                <w:sz w:val="18"/>
+              </w:rPr>
+              <w:t>Reverso</w:t>
+            </w:r>
+          </w:p>
+        </w:tc>
+        <w:tc>
+          <w:tcPr>
+            <w:tcW w:type="dxa" w:w="2351"/>
+          </w:tcPr>
+          <w:p>
+            <w:pPr>
+              <w:spacing w:line="240" w:lineRule="auto"/>
+            </w:pPr>
+            <w:r>
+              <w:rPr>
+                <w:rFonts w:ascii="Arial" w:hAnsi="Arial"/>
+                <w:sz w:val="18"/>
+              </w:rPr>
+              <w:t>596</w:t>
+            </w:r>
+          </w:p>
+        </w:tc>
+        <w:tc>
+          <w:tcPr>
+            <w:tcW w:type="dxa" w:w="2351"/>
+          </w:tcPr>
+          <w:p>
+            <w:pPr>
+              <w:spacing w:line="240" w:lineRule="auto"/>
+            </w:pPr>
+            <w:r>
+              <w:rPr>
+                <w:rFonts w:ascii="Arial" w:hAnsi="Arial"/>
+                <w:sz w:val="18"/>
+              </w:rPr>
+              <w:t>Total retenciones por cambio de sujeto</w:t>
             </w:r>
           </w:p>
         </w:tc>
@@ -8305,7 +8411,7 @@
     <w:p/>
     <w:p>
       <w:r>
-        <w:t>Dónde se registra el IVA retenido total o parcial: en la línea 5 (código 515 y 587) las facturas de compra recibidas con retención total y en las líneas 6 (código 720) y 14 (códigos 516 y 517) las recibidas con retención parcial; estas tres las usa el vendedor retenido. El comprador que emite la factura de compra la registra en la línea 25 (códigos 519 y 520) y paga el IVA retenido en el reverso del formulario. ⚠️ Confirmar con el profesor la línea y el código exactos del reverso.</w:t>
+        <w:t>Dónde se registra el IVA retenido total o parcial. Agente retenedor (la empresa compradora): la factura de compra emitida va en la línea 25 (códigos 519 y 520, crédito fiscal) y el IVA retenido se declara en el reverso: código 39 si la retención es total y código 554 si es parcial; el código 596 suma las retenciones. Vendedor retenido: línea 5 (códigos 515 y 587) si la retención es total, y líneas 6 (código 720) y 14 (códigos 516 y 517) si es parcial. Los productos silvestres tienen retención total. El N° de línea del reverso cambia según el año del formulario ⚠️.</w:t>
       </w:r>
     </w:p>
     <w:p>
@@ -8318,7 +8424,7 @@
     </w:p>
     <w:p>
       <w:r>
-        <w:t>⚠️ Pendiente: confirmar con el profesor qué declaración jurada corresponde. Contenido de ejemplo: proveedor, RUT, monto neto e IVA retenido.</w:t>
+        <w:t>Corresponde la declaración jurada F3500, informe mensual de retenedores de cambio de sujeto de IVA. Se presenta cada mes, hasta el día 15 del mes siguiente (si no es día hábil, el siguiente hábil), aunque no haya movimiento, informando operación por operación. Los códigos de producto de los silvestres son: 3101 rosa mosqueta, 3102 mora, 3103 hongos, 3104 frutos de espino y 3105 hojas de boldo. Los facturadores electrónicos que documentan todo por ese medio y envían su libro de compras y ventas no están obligados a presentarla. ⚠️ Verificar formato vigente.</w:t>
       </w:r>
     </w:p>
     <w:tbl>
@@ -8328,15 +8434,18 @@
         <w:tblLook w:firstColumn="1" w:firstRow="1" w:lastColumn="0" w:lastRow="0" w:noHBand="0" w:noVBand="1" w:val="04A0"/>
       </w:tblPr>
       <w:tblGrid>
-        <w:gridCol w:w="2351"/>
-        <w:gridCol w:w="2351"/>
-        <w:gridCol w:w="2351"/>
-        <w:gridCol w:w="2351"/>
+        <w:gridCol w:w="1344"/>
+        <w:gridCol w:w="1344"/>
+        <w:gridCol w:w="1344"/>
+        <w:gridCol w:w="1344"/>
+        <w:gridCol w:w="1344"/>
+        <w:gridCol w:w="1344"/>
+        <w:gridCol w:w="1344"/>
       </w:tblGrid>
       <w:tr>
         <w:tc>
           <w:tcPr>
-            <w:tcW w:type="dxa" w:w="2351"/>
+            <w:tcW w:type="dxa" w:w="1344"/>
           </w:tcPr>
           <w:p>
             <w:pPr>
@@ -8348,13 +8457,13 @@
                 <w:b/>
                 <w:sz w:val="18"/>
               </w:rPr>
-              <w:t>RUT</w:t>
-            </w:r>
-          </w:p>
-        </w:tc>
-        <w:tc>
-          <w:tcPr>
-            <w:tcW w:type="dxa" w:w="2351"/>
+              <w:t>RUT vendedor</w:t>
+            </w:r>
+          </w:p>
+        </w:tc>
+        <w:tc>
+          <w:tcPr>
+            <w:tcW w:type="dxa" w:w="1344"/>
           </w:tcPr>
           <w:p>
             <w:pPr>
@@ -8366,13 +8475,13 @@
                 <w:b/>
                 <w:sz w:val="18"/>
               </w:rPr>
-              <w:t>Proveedor</w:t>
-            </w:r>
-          </w:p>
-        </w:tc>
-        <w:tc>
-          <w:tcPr>
-            <w:tcW w:type="dxa" w:w="2351"/>
+              <w:t>Cód. producto</w:t>
+            </w:r>
+          </w:p>
+        </w:tc>
+        <w:tc>
+          <w:tcPr>
+            <w:tcW w:type="dxa" w:w="1344"/>
           </w:tcPr>
           <w:p>
             <w:pPr>
@@ -8384,13 +8493,13 @@
                 <w:b/>
                 <w:sz w:val="18"/>
               </w:rPr>
-              <w:t>Monto neto</w:t>
-            </w:r>
-          </w:p>
-        </w:tc>
-        <w:tc>
-          <w:tcPr>
-            <w:tcW w:type="dxa" w:w="2351"/>
+              <w:t>Producto</w:t>
+            </w:r>
+          </w:p>
+        </w:tc>
+        <w:tc>
+          <w:tcPr>
+            <w:tcW w:type="dxa" w:w="1344"/>
           </w:tcPr>
           <w:p>
             <w:pPr>
@@ -8402,6 +8511,60 @@
                 <w:b/>
                 <w:sz w:val="18"/>
               </w:rPr>
+              <w:t>Doc.</w:t>
+            </w:r>
+          </w:p>
+        </w:tc>
+        <w:tc>
+          <w:tcPr>
+            <w:tcW w:type="dxa" w:w="1344"/>
+          </w:tcPr>
+          <w:p>
+            <w:pPr>
+              <w:spacing w:line="240" w:lineRule="auto"/>
+            </w:pPr>
+            <w:r>
+              <w:rPr>
+                <w:rFonts w:ascii="Arial" w:hAnsi="Arial"/>
+                <w:b/>
+                <w:sz w:val="18"/>
+              </w:rPr>
+              <w:t>N°</w:t>
+            </w:r>
+          </w:p>
+        </w:tc>
+        <w:tc>
+          <w:tcPr>
+            <w:tcW w:type="dxa" w:w="1344"/>
+          </w:tcPr>
+          <w:p>
+            <w:pPr>
+              <w:spacing w:line="240" w:lineRule="auto"/>
+            </w:pPr>
+            <w:r>
+              <w:rPr>
+                <w:rFonts w:ascii="Arial" w:hAnsi="Arial"/>
+                <w:b/>
+                <w:sz w:val="18"/>
+              </w:rPr>
+              <w:t>Cantidad (kg)</w:t>
+            </w:r>
+          </w:p>
+        </w:tc>
+        <w:tc>
+          <w:tcPr>
+            <w:tcW w:type="dxa" w:w="1344"/>
+          </w:tcPr>
+          <w:p>
+            <w:pPr>
+              <w:spacing w:line="240" w:lineRule="auto"/>
+            </w:pPr>
+            <w:r>
+              <w:rPr>
+                <w:rFonts w:ascii="Arial" w:hAnsi="Arial"/>
+                <w:b/>
+                <w:sz w:val="18"/>
+              </w:rPr>
               <w:t>IVA retenido</w:t>
             </w:r>
           </w:p>
@@ -8410,7 +8573,7 @@
       <w:tr>
         <w:tc>
           <w:tcPr>
-            <w:tcW w:type="dxa" w:w="2351"/>
+            <w:tcW w:type="dxa" w:w="1344"/>
           </w:tcPr>
           <w:p>
             <w:pPr>
@@ -8427,7 +8590,7 @@
         </w:tc>
         <w:tc>
           <w:tcPr>
-            <w:tcW w:type="dxa" w:w="2351"/>
+            <w:tcW w:type="dxa" w:w="1344"/>
           </w:tcPr>
           <w:p>
             <w:pPr>
@@ -8438,13 +8601,13 @@
                 <w:rFonts w:ascii="Arial" w:hAnsi="Arial"/>
                 <w:sz w:val="18"/>
               </w:rPr>
-              <w:t>Juan Pérez (recolector)</w:t>
-            </w:r>
-          </w:p>
-        </w:tc>
-        <w:tc>
-          <w:tcPr>
-            <w:tcW w:type="dxa" w:w="2351"/>
+              <w:t>3101</w:t>
+            </w:r>
+          </w:p>
+        </w:tc>
+        <w:tc>
+          <w:tcPr>
+            <w:tcW w:type="dxa" w:w="1344"/>
           </w:tcPr>
           <w:p>
             <w:pPr>
@@ -8455,13 +8618,64 @@
                 <w:rFonts w:ascii="Arial" w:hAnsi="Arial"/>
                 <w:sz w:val="18"/>
               </w:rPr>
-              <w:t>1.800.000</w:t>
-            </w:r>
-          </w:p>
-        </w:tc>
-        <w:tc>
-          <w:tcPr>
-            <w:tcW w:type="dxa" w:w="2351"/>
+              <w:t>Rosa mosqueta</w:t>
+            </w:r>
+          </w:p>
+        </w:tc>
+        <w:tc>
+          <w:tcPr>
+            <w:tcW w:type="dxa" w:w="1344"/>
+          </w:tcPr>
+          <w:p>
+            <w:pPr>
+              <w:spacing w:line="240" w:lineRule="auto"/>
+            </w:pPr>
+            <w:r>
+              <w:rPr>
+                <w:rFonts w:ascii="Arial" w:hAnsi="Arial"/>
+                <w:sz w:val="18"/>
+              </w:rPr>
+              <w:t>46</w:t>
+            </w:r>
+          </w:p>
+        </w:tc>
+        <w:tc>
+          <w:tcPr>
+            <w:tcW w:type="dxa" w:w="1344"/>
+          </w:tcPr>
+          <w:p>
+            <w:pPr>
+              <w:spacing w:line="240" w:lineRule="auto"/>
+            </w:pPr>
+            <w:r>
+              <w:rPr>
+                <w:rFonts w:ascii="Arial" w:hAnsi="Arial"/>
+                <w:sz w:val="18"/>
+              </w:rPr>
+              <w:t>201</w:t>
+            </w:r>
+          </w:p>
+        </w:tc>
+        <w:tc>
+          <w:tcPr>
+            <w:tcW w:type="dxa" w:w="1344"/>
+          </w:tcPr>
+          <w:p>
+            <w:pPr>
+              <w:spacing w:line="240" w:lineRule="auto"/>
+            </w:pPr>
+            <w:r>
+              <w:rPr>
+                <w:rFonts w:ascii="Arial" w:hAnsi="Arial"/>
+                <w:sz w:val="18"/>
+              </w:rPr>
+              <w:t>1.200</w:t>
+            </w:r>
+          </w:p>
+        </w:tc>
+        <w:tc>
+          <w:tcPr>
+            <w:tcW w:type="dxa" w:w="1344"/>
           </w:tcPr>
           <w:p>
             <w:pPr>
@@ -8480,7 +8694,7 @@
       <w:tr>
         <w:tc>
           <w:tcPr>
-            <w:tcW w:type="dxa" w:w="2351"/>
+            <w:tcW w:type="dxa" w:w="1344"/>
           </w:tcPr>
           <w:p>
             <w:pPr>
@@ -8491,13 +8705,13 @@
                 <w:rFonts w:ascii="Arial" w:hAnsi="Arial"/>
                 <w:sz w:val="18"/>
               </w:rPr>
-              <w:t>12.222.222-2</w:t>
-            </w:r>
-          </w:p>
-        </w:tc>
-        <w:tc>
-          <w:tcPr>
-            <w:tcW w:type="dxa" w:w="2351"/>
+              <w:t>12.222.222-5</w:t>
+            </w:r>
+          </w:p>
+        </w:tc>
+        <w:tc>
+          <w:tcPr>
+            <w:tcW w:type="dxa" w:w="1344"/>
           </w:tcPr>
           <w:p>
             <w:pPr>
@@ -8508,13 +8722,13 @@
                 <w:rFonts w:ascii="Arial" w:hAnsi="Arial"/>
                 <w:sz w:val="18"/>
               </w:rPr>
-              <w:t>María Soto (recolectora)</w:t>
-            </w:r>
-          </w:p>
-        </w:tc>
-        <w:tc>
-          <w:tcPr>
-            <w:tcW w:type="dxa" w:w="2351"/>
+              <w:t>3103</w:t>
+            </w:r>
+          </w:p>
+        </w:tc>
+        <w:tc>
+          <w:tcPr>
+            <w:tcW w:type="dxa" w:w="1344"/>
           </w:tcPr>
           <w:p>
             <w:pPr>
@@ -8525,13 +8739,64 @@
                 <w:rFonts w:ascii="Arial" w:hAnsi="Arial"/>
                 <w:sz w:val="18"/>
               </w:rPr>
-              <w:t>1.200.000</w:t>
-            </w:r>
-          </w:p>
-        </w:tc>
-        <w:tc>
-          <w:tcPr>
-            <w:tcW w:type="dxa" w:w="2351"/>
+              <w:t>Hongos</w:t>
+            </w:r>
+          </w:p>
+        </w:tc>
+        <w:tc>
+          <w:tcPr>
+            <w:tcW w:type="dxa" w:w="1344"/>
+          </w:tcPr>
+          <w:p>
+            <w:pPr>
+              <w:spacing w:line="240" w:lineRule="auto"/>
+            </w:pPr>
+            <w:r>
+              <w:rPr>
+                <w:rFonts w:ascii="Arial" w:hAnsi="Arial"/>
+                <w:sz w:val="18"/>
+              </w:rPr>
+              <w:t>46</w:t>
+            </w:r>
+          </w:p>
+        </w:tc>
+        <w:tc>
+          <w:tcPr>
+            <w:tcW w:type="dxa" w:w="1344"/>
+          </w:tcPr>
+          <w:p>
+            <w:pPr>
+              <w:spacing w:line="240" w:lineRule="auto"/>
+            </w:pPr>
+            <w:r>
+              <w:rPr>
+                <w:rFonts w:ascii="Arial" w:hAnsi="Arial"/>
+                <w:sz w:val="18"/>
+              </w:rPr>
+              <w:t>202</w:t>
+            </w:r>
+          </w:p>
+        </w:tc>
+        <w:tc>
+          <w:tcPr>
+            <w:tcW w:type="dxa" w:w="1344"/>
+          </w:tcPr>
+          <w:p>
+            <w:pPr>
+              <w:spacing w:line="240" w:lineRule="auto"/>
+            </w:pPr>
+            <w:r>
+              <w:rPr>
+                <w:rFonts w:ascii="Arial" w:hAnsi="Arial"/>
+                <w:sz w:val="18"/>
+              </w:rPr>
+              <w:t>300</w:t>
+            </w:r>
+          </w:p>
+        </w:tc>
+        <w:tc>
+          <w:tcPr>
+            <w:tcW w:type="dxa" w:w="1344"/>
           </w:tcPr>
           <w:p>
             <w:pPr>
@@ -8550,7 +8815,7 @@
       <w:tr>
         <w:tc>
           <w:tcPr>
-            <w:tcW w:type="dxa" w:w="2351"/>
+            <w:tcW w:type="dxa" w:w="1344"/>
           </w:tcPr>
           <w:p>
             <w:pPr>
@@ -8561,13 +8826,13 @@
                 <w:rFonts w:ascii="Arial" w:hAnsi="Arial"/>
                 <w:sz w:val="18"/>
               </w:rPr>
-              <w:t>13.333.333-3</w:t>
-            </w:r>
-          </w:p>
-        </w:tc>
-        <w:tc>
-          <w:tcPr>
-            <w:tcW w:type="dxa" w:w="2351"/>
+              <w:t>13.333.333-9</w:t>
+            </w:r>
+          </w:p>
+        </w:tc>
+        <w:tc>
+          <w:tcPr>
+            <w:tcW w:type="dxa" w:w="1344"/>
           </w:tcPr>
           <w:p>
             <w:pPr>
@@ -8578,13 +8843,13 @@
                 <w:rFonts w:ascii="Arial" w:hAnsi="Arial"/>
                 <w:sz w:val="18"/>
               </w:rPr>
-              <w:t>Pedro Núñez (recolector)</w:t>
-            </w:r>
-          </w:p>
-        </w:tc>
-        <w:tc>
-          <w:tcPr>
-            <w:tcW w:type="dxa" w:w="2351"/>
+              <w:t>3102</w:t>
+            </w:r>
+          </w:p>
+        </w:tc>
+        <w:tc>
+          <w:tcPr>
+            <w:tcW w:type="dxa" w:w="1344"/>
           </w:tcPr>
           <w:p>
             <w:pPr>
@@ -8595,13 +8860,64 @@
                 <w:rFonts w:ascii="Arial" w:hAnsi="Arial"/>
                 <w:sz w:val="18"/>
               </w:rPr>
-              <w:t>800.000</w:t>
-            </w:r>
-          </w:p>
-        </w:tc>
-        <w:tc>
-          <w:tcPr>
-            <w:tcW w:type="dxa" w:w="2351"/>
+              <w:t>Mora</w:t>
+            </w:r>
+          </w:p>
+        </w:tc>
+        <w:tc>
+          <w:tcPr>
+            <w:tcW w:type="dxa" w:w="1344"/>
+          </w:tcPr>
+          <w:p>
+            <w:pPr>
+              <w:spacing w:line="240" w:lineRule="auto"/>
+            </w:pPr>
+            <w:r>
+              <w:rPr>
+                <w:rFonts w:ascii="Arial" w:hAnsi="Arial"/>
+                <w:sz w:val="18"/>
+              </w:rPr>
+              <w:t>46</w:t>
+            </w:r>
+          </w:p>
+        </w:tc>
+        <w:tc>
+          <w:tcPr>
+            <w:tcW w:type="dxa" w:w="1344"/>
+          </w:tcPr>
+          <w:p>
+            <w:pPr>
+              <w:spacing w:line="240" w:lineRule="auto"/>
+            </w:pPr>
+            <w:r>
+              <w:rPr>
+                <w:rFonts w:ascii="Arial" w:hAnsi="Arial"/>
+                <w:sz w:val="18"/>
+              </w:rPr>
+              <w:t>203</w:t>
+            </w:r>
+          </w:p>
+        </w:tc>
+        <w:tc>
+          <w:tcPr>
+            <w:tcW w:type="dxa" w:w="1344"/>
+          </w:tcPr>
+          <w:p>
+            <w:pPr>
+              <w:spacing w:line="240" w:lineRule="auto"/>
+            </w:pPr>
+            <w:r>
+              <w:rPr>
+                <w:rFonts w:ascii="Arial" w:hAnsi="Arial"/>
+                <w:sz w:val="18"/>
+              </w:rPr>
+              <w:t>500</w:t>
+            </w:r>
+          </w:p>
+        </w:tc>
+        <w:tc>
+          <w:tcPr>
+            <w:tcW w:type="dxa" w:w="1344"/>
           </w:tcPr>
           <w:p>
             <w:pPr>
@@ -8620,7 +8936,7 @@
       <w:tr>
         <w:tc>
           <w:tcPr>
-            <w:tcW w:type="dxa" w:w="2351"/>
+            <w:tcW w:type="dxa" w:w="1344"/>
           </w:tcPr>
           <w:p>
             <w:pPr>
@@ -8631,13 +8947,13 @@
                 <w:rFonts w:ascii="Arial" w:hAnsi="Arial"/>
                 <w:sz w:val="18"/>
               </w:rPr>
-              <w:t>14.444.444-4</w:t>
-            </w:r>
-          </w:p>
-        </w:tc>
-        <w:tc>
-          <w:tcPr>
-            <w:tcW w:type="dxa" w:w="2351"/>
+              <w:t>14.444.444-2</w:t>
+            </w:r>
+          </w:p>
+        </w:tc>
+        <w:tc>
+          <w:tcPr>
+            <w:tcW w:type="dxa" w:w="1344"/>
           </w:tcPr>
           <w:p>
             <w:pPr>
@@ -8648,13 +8964,13 @@
                 <w:rFonts w:ascii="Arial" w:hAnsi="Arial"/>
                 <w:sz w:val="18"/>
               </w:rPr>
-              <w:t>Rosa Muñoz (recolectora)</w:t>
-            </w:r>
-          </w:p>
-        </w:tc>
-        <w:tc>
-          <w:tcPr>
-            <w:tcW w:type="dxa" w:w="2351"/>
+              <w:t>3105</w:t>
+            </w:r>
+          </w:p>
+        </w:tc>
+        <w:tc>
+          <w:tcPr>
+            <w:tcW w:type="dxa" w:w="1344"/>
           </w:tcPr>
           <w:p>
             <w:pPr>
@@ -8665,13 +8981,64 @@
                 <w:rFonts w:ascii="Arial" w:hAnsi="Arial"/>
                 <w:sz w:val="18"/>
               </w:rPr>
-              <w:t>500.000</w:t>
-            </w:r>
-          </w:p>
-        </w:tc>
-        <w:tc>
-          <w:tcPr>
-            <w:tcW w:type="dxa" w:w="2351"/>
+              <w:t>Hojas de boldo</w:t>
+            </w:r>
+          </w:p>
+        </w:tc>
+        <w:tc>
+          <w:tcPr>
+            <w:tcW w:type="dxa" w:w="1344"/>
+          </w:tcPr>
+          <w:p>
+            <w:pPr>
+              <w:spacing w:line="240" w:lineRule="auto"/>
+            </w:pPr>
+            <w:r>
+              <w:rPr>
+                <w:rFonts w:ascii="Arial" w:hAnsi="Arial"/>
+                <w:sz w:val="18"/>
+              </w:rPr>
+              <w:t>46</w:t>
+            </w:r>
+          </w:p>
+        </w:tc>
+        <w:tc>
+          <w:tcPr>
+            <w:tcW w:type="dxa" w:w="1344"/>
+          </w:tcPr>
+          <w:p>
+            <w:pPr>
+              <w:spacing w:line="240" w:lineRule="auto"/>
+            </w:pPr>
+            <w:r>
+              <w:rPr>
+                <w:rFonts w:ascii="Arial" w:hAnsi="Arial"/>
+                <w:sz w:val="18"/>
+              </w:rPr>
+              <w:t>204</w:t>
+            </w:r>
+          </w:p>
+        </w:tc>
+        <w:tc>
+          <w:tcPr>
+            <w:tcW w:type="dxa" w:w="1344"/>
+          </w:tcPr>
+          <w:p>
+            <w:pPr>
+              <w:spacing w:line="240" w:lineRule="auto"/>
+            </w:pPr>
+            <w:r>
+              <w:rPr>
+                <w:rFonts w:ascii="Arial" w:hAnsi="Arial"/>
+                <w:sz w:val="18"/>
+              </w:rPr>
+              <w:t>400</w:t>
+            </w:r>
+          </w:p>
+        </w:tc>
+        <w:tc>
+          <w:tcPr>
+            <w:tcW w:type="dxa" w:w="1344"/>
           </w:tcPr>
           <w:p>
             <w:pPr>
@@ -8690,7 +9057,7 @@
       <w:tr>
         <w:tc>
           <w:tcPr>
-            <w:tcW w:type="dxa" w:w="2351"/>
+            <w:tcW w:type="dxa" w:w="1344"/>
           </w:tcPr>
           <w:p>
             <w:pPr>
@@ -8701,13 +9068,13 @@
                 <w:rFonts w:ascii="Arial" w:hAnsi="Arial"/>
                 <w:sz w:val="18"/>
               </w:rPr>
-              <w:t>15.555.555-5</w:t>
-            </w:r>
-          </w:p>
-        </w:tc>
-        <w:tc>
-          <w:tcPr>
-            <w:tcW w:type="dxa" w:w="2351"/>
+              <w:t>15.555.555-6</w:t>
+            </w:r>
+          </w:p>
+        </w:tc>
+        <w:tc>
+          <w:tcPr>
+            <w:tcW w:type="dxa" w:w="1344"/>
           </w:tcPr>
           <w:p>
             <w:pPr>
@@ -8718,13 +9085,13 @@
                 <w:rFonts w:ascii="Arial" w:hAnsi="Arial"/>
                 <w:sz w:val="18"/>
               </w:rPr>
-              <w:t>Luis Araya (recolector)</w:t>
-            </w:r>
-          </w:p>
-        </w:tc>
-        <w:tc>
-          <w:tcPr>
-            <w:tcW w:type="dxa" w:w="2351"/>
+              <w:t>3104</w:t>
+            </w:r>
+          </w:p>
+        </w:tc>
+        <w:tc>
+          <w:tcPr>
+            <w:tcW w:type="dxa" w:w="1344"/>
           </w:tcPr>
           <w:p>
             <w:pPr>
@@ -8735,13 +9102,64 @@
                 <w:rFonts w:ascii="Arial" w:hAnsi="Arial"/>
                 <w:sz w:val="18"/>
               </w:rPr>
-              <w:t>1.350.000</w:t>
-            </w:r>
-          </w:p>
-        </w:tc>
-        <w:tc>
-          <w:tcPr>
-            <w:tcW w:type="dxa" w:w="2351"/>
+              <w:t>Frutos de espino</w:t>
+            </w:r>
+          </w:p>
+        </w:tc>
+        <w:tc>
+          <w:tcPr>
+            <w:tcW w:type="dxa" w:w="1344"/>
+          </w:tcPr>
+          <w:p>
+            <w:pPr>
+              <w:spacing w:line="240" w:lineRule="auto"/>
+            </w:pPr>
+            <w:r>
+              <w:rPr>
+                <w:rFonts w:ascii="Arial" w:hAnsi="Arial"/>
+                <w:sz w:val="18"/>
+              </w:rPr>
+              <w:t>46</w:t>
+            </w:r>
+          </w:p>
+        </w:tc>
+        <w:tc>
+          <w:tcPr>
+            <w:tcW w:type="dxa" w:w="1344"/>
+          </w:tcPr>
+          <w:p>
+            <w:pPr>
+              <w:spacing w:line="240" w:lineRule="auto"/>
+            </w:pPr>
+            <w:r>
+              <w:rPr>
+                <w:rFonts w:ascii="Arial" w:hAnsi="Arial"/>
+                <w:sz w:val="18"/>
+              </w:rPr>
+              <w:t>205</w:t>
+            </w:r>
+          </w:p>
+        </w:tc>
+        <w:tc>
+          <w:tcPr>
+            <w:tcW w:type="dxa" w:w="1344"/>
+          </w:tcPr>
+          <w:p>
+            <w:pPr>
+              <w:spacing w:line="240" w:lineRule="auto"/>
+            </w:pPr>
+            <w:r>
+              <w:rPr>
+                <w:rFonts w:ascii="Arial" w:hAnsi="Arial"/>
+                <w:sz w:val="18"/>
+              </w:rPr>
+              <w:t>900</w:t>
+            </w:r>
+          </w:p>
+        </w:tc>
+        <w:tc>
+          <w:tcPr>
+            <w:tcW w:type="dxa" w:w="1344"/>
           </w:tcPr>
           <w:p>
             <w:pPr>
@@ -8760,7 +9178,7 @@
       <w:tr>
         <w:tc>
           <w:tcPr>
-            <w:tcW w:type="dxa" w:w="2351"/>
+            <w:tcW w:type="dxa" w:w="1344"/>
           </w:tcPr>
           <w:p>
             <w:pPr>
@@ -8776,7 +9194,7 @@
         </w:tc>
         <w:tc>
           <w:tcPr>
-            <w:tcW w:type="dxa" w:w="2351"/>
+            <w:tcW w:type="dxa" w:w="1344"/>
           </w:tcPr>
           <w:p>
             <w:pPr>
@@ -8787,13 +9205,29 @@
                 <w:rFonts w:ascii="Arial" w:hAnsi="Arial"/>
                 <w:sz w:val="18"/>
               </w:rPr>
+            </w:r>
+          </w:p>
+        </w:tc>
+        <w:tc>
+          <w:tcPr>
+            <w:tcW w:type="dxa" w:w="1344"/>
+          </w:tcPr>
+          <w:p>
+            <w:pPr>
+              <w:spacing w:line="240" w:lineRule="auto"/>
+            </w:pPr>
+            <w:r>
+              <w:rPr>
+                <w:rFonts w:ascii="Arial" w:hAnsi="Arial"/>
+                <w:sz w:val="18"/>
+              </w:rPr>
               <w:t>TOTAL</w:t>
             </w:r>
           </w:p>
         </w:tc>
         <w:tc>
           <w:tcPr>
-            <w:tcW w:type="dxa" w:w="2351"/>
+            <w:tcW w:type="dxa" w:w="1344"/>
           </w:tcPr>
           <w:p>
             <w:pPr>
@@ -8804,13 +9238,44 @@
                 <w:rFonts w:ascii="Arial" w:hAnsi="Arial"/>
                 <w:sz w:val="18"/>
               </w:rPr>
-              <w:t>5.650.000</w:t>
-            </w:r>
-          </w:p>
-        </w:tc>
-        <w:tc>
-          <w:tcPr>
-            <w:tcW w:type="dxa" w:w="2351"/>
+            </w:r>
+          </w:p>
+        </w:tc>
+        <w:tc>
+          <w:tcPr>
+            <w:tcW w:type="dxa" w:w="1344"/>
+          </w:tcPr>
+          <w:p>
+            <w:pPr>
+              <w:spacing w:line="240" w:lineRule="auto"/>
+            </w:pPr>
+            <w:r>
+              <w:rPr>
+                <w:rFonts w:ascii="Arial" w:hAnsi="Arial"/>
+                <w:sz w:val="18"/>
+              </w:rPr>
+            </w:r>
+          </w:p>
+        </w:tc>
+        <w:tc>
+          <w:tcPr>
+            <w:tcW w:type="dxa" w:w="1344"/>
+          </w:tcPr>
+          <w:p>
+            <w:pPr>
+              <w:spacing w:line="240" w:lineRule="auto"/>
+            </w:pPr>
+            <w:r>
+              <w:rPr>
+                <w:rFonts w:ascii="Arial" w:hAnsi="Arial"/>
+                <w:sz w:val="18"/>
+              </w:rPr>
+            </w:r>
+          </w:p>
+        </w:tc>
+        <w:tc>
+          <w:tcPr>
+            <w:tcW w:type="dxa" w:w="1344"/>
           </w:tcPr>
           <w:p>
             <w:pPr>

</xml_diff>

<commit_message>
Normativa de octubre 2026 (PDF del alumno), IVA retenido sin crédito fiscal, cotización del empleador sin doble conteo del SIS
Co-Authored-By: Claude Sonnet 5.5 <noreply@anthropic.com>
Claude-Session: https://claude.ai/code/session_012WV3i5CNskdg7dgJ6kwcHp
</commit_message>
<xml_diff>
--- a/trabajo_juan_castillo/cambio_sujeto_silvestres.docx
+++ b/trabajo_juan_castillo/cambio_sujeto_silvestres.docx
@@ -150,12 +150,12 @@
     </w:p>
     <w:p>
       <w:r>
-        <w:t>[ADJUNTAR AQUÍ LA RESOLUCIÓN: Resolución Exenta SII N° 4095 del 25 de agosto de 2000 ⚠️ copiar el texto desde sii.cl]</w:t>
+        <w:t>[ADJUNTAR AQUÍ LA RESOLUCIÓN: Resolución Exenta SII N° 4095 del 25 de agosto de 2000, texto en sii.cl/documentos/resoluciones/2000b/reso4095.htm]</w:t>
       </w:r>
     </w:p>
     <w:p>
       <w:r>
-        <w:t>La Resolución Exenta N° 4095 de 2000 dispone el cambio de sujeto de derecho del IVA en las ventas de productos silvestres: el comprador debe emitir una factura de compra, retener el IVA y declararlo y pagarlo; el vendedor no está obligado a emitir factura por esa venta. La retención es total, es decir, el 100 % del IVA de la operación. Los productos incluyen rosa mosqueta, mora, hongos, frutos de espino, hojas de boldo, tilo, manzanilla, llantén, toronjil, cedrón, hierbas pectorales, romero, quillay, hierba de hipérico y cera de abeja. La Resolución Ex. N° 2 de 2018 mantiene vigente este régimen. ⚠️ Datos tomados de resúmenes de búsqueda: contrastar con el texto oficial del SII.</w:t>
+        <w:t>La Resolución Exenta SII N° 4095 del 25 de agosto de 2000 dispone el cambio de sujeto de derecho del IVA en los productos silvestres (rige desde el 1 de septiembre de 2000, por tiempo indefinido). Productos: rosa mosqueta, mora, hongos, frutos de espino, hojas de boldo, tilo, manzanilla, llantén, toronjil, cedrón, hierbas pectorales, romero, hojas y corteza de quillay, hierba de hipérico y cera de abeja. Retienen el IVA los compradores que venden a exportadores y los compradores nacionales de Primera Categoría con contabilidad completa que superen $50.000.000 de compras anuales. El comprador emite una factura de compra (DTE 46), recarga el IVA y lo declara y paga en el F29 sin derecho a crédito fiscal; el vendedor no emite factura y usa el IVA retenido como crédito contra sus débitos. La retención es total (100 % del IVA; la resolución citaba 18 % porque esa era la tasa del año 2000, hoy 19 %). La empresa del ejemplo compra más de $50.000.000 al año, por lo que es agente retenedor.</w:t>
       </w:r>
     </w:p>
     <w:p>
@@ -898,7 +898,7 @@
     </w:p>
     <w:p>
       <w:r>
-        <w:t>Libro de compras (cinco facturas de compra; el crédito fiscal es el IVA total):</w:t>
+        <w:t>Libro de compras (cinco facturas de compra; el IVA retenido total no da derecho a crédito fiscal):</w:t>
       </w:r>
     </w:p>
     <w:tbl>
@@ -3024,7 +3024,7 @@
                 <w:rFonts w:ascii="Arial" w:hAnsi="Arial"/>
                 <w:sz w:val="16"/>
               </w:rPr>
-              <w:t>1.800.000</w:t>
+              <w:t>2.142.000</w:t>
             </w:r>
           </w:p>
         </w:tc>
@@ -3091,7 +3091,7 @@
                 <w:rFonts w:ascii="Arial" w:hAnsi="Arial"/>
                 <w:sz w:val="16"/>
               </w:rPr>
-              <w:t>1.1.04 IVA crédito fiscal</w:t>
+              <w:t xml:space="preserve">      2.1.01 Proveedores</w:t>
             </w:r>
           </w:p>
         </w:tc>
@@ -3108,7 +3108,6 @@
                 <w:rFonts w:ascii="Arial" w:hAnsi="Arial"/>
                 <w:sz w:val="16"/>
               </w:rPr>
-              <w:t>342.000</w:t>
             </w:r>
           </w:p>
         </w:tc>
@@ -3125,6 +3124,7 @@
                 <w:rFonts w:ascii="Arial" w:hAnsi="Arial"/>
                 <w:sz w:val="16"/>
               </w:rPr>
+              <w:t>1.800.000</w:t>
             </w:r>
           </w:p>
         </w:tc>
@@ -3175,7 +3175,7 @@
                 <w:rFonts w:ascii="Arial" w:hAnsi="Arial"/>
                 <w:sz w:val="16"/>
               </w:rPr>
-              <w:t xml:space="preserve">      2.1.01 Proveedores</w:t>
+              <w:t xml:space="preserve">      2.1.09 IVA retenido por pagar</w:t>
             </w:r>
           </w:p>
         </w:tc>
@@ -3208,7 +3208,7 @@
                 <w:rFonts w:ascii="Arial" w:hAnsi="Arial"/>
                 <w:sz w:val="16"/>
               </w:rPr>
-              <w:t>1.800.000</w:t>
+              <w:t>342.000</w:t>
             </w:r>
           </w:p>
         </w:tc>
@@ -3227,6 +3227,7 @@
                 <w:rFonts w:ascii="Arial" w:hAnsi="Arial"/>
                 <w:sz w:val="16"/>
               </w:rPr>
+              <w:t>2</w:t>
             </w:r>
           </w:p>
         </w:tc>
@@ -3243,6 +3244,7 @@
                 <w:rFonts w:ascii="Arial" w:hAnsi="Arial"/>
                 <w:sz w:val="16"/>
               </w:rPr>
+              <w:t>06-10-2026</w:t>
             </w:r>
           </w:p>
         </w:tc>
@@ -3259,7 +3261,7 @@
                 <w:rFonts w:ascii="Arial" w:hAnsi="Arial"/>
                 <w:sz w:val="16"/>
               </w:rPr>
-              <w:t xml:space="preserve">      2.1.09 IVA retenido por pagar</w:t>
+              <w:t>Factura de compra N°202: Hongos (IVA retenido)</w:t>
             </w:r>
           </w:p>
         </w:tc>
@@ -3292,7 +3294,6 @@
                 <w:rFonts w:ascii="Arial" w:hAnsi="Arial"/>
                 <w:sz w:val="16"/>
               </w:rPr>
-              <w:t>342.000</w:t>
             </w:r>
           </w:p>
         </w:tc>
@@ -3311,7 +3312,6 @@
                 <w:rFonts w:ascii="Arial" w:hAnsi="Arial"/>
                 <w:sz w:val="16"/>
               </w:rPr>
-              <w:t>2</w:t>
             </w:r>
           </w:p>
         </w:tc>
@@ -3328,7 +3328,6 @@
                 <w:rFonts w:ascii="Arial" w:hAnsi="Arial"/>
                 <w:sz w:val="16"/>
               </w:rPr>
-              <w:t>06-10-2026</w:t>
             </w:r>
           </w:p>
         </w:tc>
@@ -3345,7 +3344,7 @@
                 <w:rFonts w:ascii="Arial" w:hAnsi="Arial"/>
                 <w:sz w:val="16"/>
               </w:rPr>
-              <w:t>Factura de compra N°202: Hongos (IVA retenido)</w:t>
+              <w:t>1.1.13 Inventario mercaderías</w:t>
             </w:r>
           </w:p>
         </w:tc>
@@ -3362,6 +3361,7 @@
                 <w:rFonts w:ascii="Arial" w:hAnsi="Arial"/>
                 <w:sz w:val="16"/>
               </w:rPr>
+              <w:t>1.428.000</w:t>
             </w:r>
           </w:p>
         </w:tc>
@@ -3428,7 +3428,7 @@
                 <w:rFonts w:ascii="Arial" w:hAnsi="Arial"/>
                 <w:sz w:val="16"/>
               </w:rPr>
-              <w:t>1.1.13 Inventario mercaderías</w:t>
+              <w:t xml:space="preserve">      2.1.01 Proveedores</w:t>
             </w:r>
           </w:p>
         </w:tc>
@@ -3445,23 +3445,23 @@
                 <w:rFonts w:ascii="Arial" w:hAnsi="Arial"/>
                 <w:sz w:val="16"/>
               </w:rPr>
+            </w:r>
+          </w:p>
+        </w:tc>
+        <w:tc>
+          <w:tcPr>
+            <w:tcW w:type="dxa" w:w="1881"/>
+          </w:tcPr>
+          <w:p>
+            <w:pPr>
+              <w:spacing w:line="240" w:lineRule="auto"/>
+            </w:pPr>
+            <w:r>
+              <w:rPr>
+                <w:rFonts w:ascii="Arial" w:hAnsi="Arial"/>
+                <w:sz w:val="16"/>
+              </w:rPr>
               <w:t>1.200.000</w:t>
-            </w:r>
-          </w:p>
-        </w:tc>
-        <w:tc>
-          <w:tcPr>
-            <w:tcW w:type="dxa" w:w="1881"/>
-          </w:tcPr>
-          <w:p>
-            <w:pPr>
-              <w:spacing w:line="240" w:lineRule="auto"/>
-            </w:pPr>
-            <w:r>
-              <w:rPr>
-                <w:rFonts w:ascii="Arial" w:hAnsi="Arial"/>
-                <w:sz w:val="16"/>
-              </w:rPr>
             </w:r>
           </w:p>
         </w:tc>
@@ -3512,7 +3512,7 @@
                 <w:rFonts w:ascii="Arial" w:hAnsi="Arial"/>
                 <w:sz w:val="16"/>
               </w:rPr>
-              <w:t>1.1.04 IVA crédito fiscal</w:t>
+              <w:t xml:space="preserve">      2.1.09 IVA retenido por pagar</w:t>
             </w:r>
           </w:p>
         </w:tc>
@@ -3529,23 +3529,23 @@
                 <w:rFonts w:ascii="Arial" w:hAnsi="Arial"/>
                 <w:sz w:val="16"/>
               </w:rPr>
+            </w:r>
+          </w:p>
+        </w:tc>
+        <w:tc>
+          <w:tcPr>
+            <w:tcW w:type="dxa" w:w="1881"/>
+          </w:tcPr>
+          <w:p>
+            <w:pPr>
+              <w:spacing w:line="240" w:lineRule="auto"/>
+            </w:pPr>
+            <w:r>
+              <w:rPr>
+                <w:rFonts w:ascii="Arial" w:hAnsi="Arial"/>
+                <w:sz w:val="16"/>
+              </w:rPr>
               <w:t>228.000</w:t>
-            </w:r>
-          </w:p>
-        </w:tc>
-        <w:tc>
-          <w:tcPr>
-            <w:tcW w:type="dxa" w:w="1881"/>
-          </w:tcPr>
-          <w:p>
-            <w:pPr>
-              <w:spacing w:line="240" w:lineRule="auto"/>
-            </w:pPr>
-            <w:r>
-              <w:rPr>
-                <w:rFonts w:ascii="Arial" w:hAnsi="Arial"/>
-                <w:sz w:val="16"/>
-              </w:rPr>
             </w:r>
           </w:p>
         </w:tc>
@@ -3564,6 +3564,7 @@
                 <w:rFonts w:ascii="Arial" w:hAnsi="Arial"/>
                 <w:sz w:val="16"/>
               </w:rPr>
+              <w:t>3</w:t>
             </w:r>
           </w:p>
         </w:tc>
@@ -3580,6 +3581,7 @@
                 <w:rFonts w:ascii="Arial" w:hAnsi="Arial"/>
                 <w:sz w:val="16"/>
               </w:rPr>
+              <w:t>12-10-2026</w:t>
             </w:r>
           </w:p>
         </w:tc>
@@ -3596,7 +3598,7 @@
                 <w:rFonts w:ascii="Arial" w:hAnsi="Arial"/>
                 <w:sz w:val="16"/>
               </w:rPr>
-              <w:t xml:space="preserve">      2.1.01 Proveedores</w:t>
+              <w:t>Factura de compra N°203: Mora (IVA retenido)</w:t>
             </w:r>
           </w:p>
         </w:tc>
@@ -3629,7 +3631,6 @@
                 <w:rFonts w:ascii="Arial" w:hAnsi="Arial"/>
                 <w:sz w:val="16"/>
               </w:rPr>
-              <w:t>1.200.000</w:t>
             </w:r>
           </w:p>
         </w:tc>
@@ -3680,7 +3681,7 @@
                 <w:rFonts w:ascii="Arial" w:hAnsi="Arial"/>
                 <w:sz w:val="16"/>
               </w:rPr>
-              <w:t xml:space="preserve">      2.1.09 IVA retenido por pagar</w:t>
+              <w:t>1.1.13 Inventario mercaderías</w:t>
             </w:r>
           </w:p>
         </w:tc>
@@ -3697,6 +3698,7 @@
                 <w:rFonts w:ascii="Arial" w:hAnsi="Arial"/>
                 <w:sz w:val="16"/>
               </w:rPr>
+              <w:t>952.000</w:t>
             </w:r>
           </w:p>
         </w:tc>
@@ -3713,7 +3715,6 @@
                 <w:rFonts w:ascii="Arial" w:hAnsi="Arial"/>
                 <w:sz w:val="16"/>
               </w:rPr>
-              <w:t>228.000</w:t>
             </w:r>
           </w:p>
         </w:tc>
@@ -3732,7 +3733,6 @@
                 <w:rFonts w:ascii="Arial" w:hAnsi="Arial"/>
                 <w:sz w:val="16"/>
               </w:rPr>
-              <w:t>3</w:t>
             </w:r>
           </w:p>
         </w:tc>
@@ -3749,7 +3749,6 @@
                 <w:rFonts w:ascii="Arial" w:hAnsi="Arial"/>
                 <w:sz w:val="16"/>
               </w:rPr>
-              <w:t>12-10-2026</w:t>
             </w:r>
           </w:p>
         </w:tc>
@@ -3766,7 +3765,7 @@
                 <w:rFonts w:ascii="Arial" w:hAnsi="Arial"/>
                 <w:sz w:val="16"/>
               </w:rPr>
-              <w:t>Factura de compra N°203: Mora (IVA retenido)</w:t>
+              <w:t xml:space="preserve">      2.1.01 Proveedores</w:t>
             </w:r>
           </w:p>
         </w:tc>
@@ -3799,6 +3798,7 @@
                 <w:rFonts w:ascii="Arial" w:hAnsi="Arial"/>
                 <w:sz w:val="16"/>
               </w:rPr>
+              <w:t>800.000</w:t>
             </w:r>
           </w:p>
         </w:tc>
@@ -3849,7 +3849,7 @@
                 <w:rFonts w:ascii="Arial" w:hAnsi="Arial"/>
                 <w:sz w:val="16"/>
               </w:rPr>
-              <w:t>1.1.13 Inventario mercaderías</w:t>
+              <w:t xml:space="preserve">      2.1.09 IVA retenido por pagar</w:t>
             </w:r>
           </w:p>
         </w:tc>
@@ -3866,7 +3866,6 @@
                 <w:rFonts w:ascii="Arial" w:hAnsi="Arial"/>
                 <w:sz w:val="16"/>
               </w:rPr>
-              <w:t>800.000</w:t>
             </w:r>
           </w:p>
         </w:tc>
@@ -3883,6 +3882,7 @@
                 <w:rFonts w:ascii="Arial" w:hAnsi="Arial"/>
                 <w:sz w:val="16"/>
               </w:rPr>
+              <w:t>152.000</w:t>
             </w:r>
           </w:p>
         </w:tc>
@@ -3901,6 +3901,7 @@
                 <w:rFonts w:ascii="Arial" w:hAnsi="Arial"/>
                 <w:sz w:val="16"/>
               </w:rPr>
+              <w:t>4</w:t>
             </w:r>
           </w:p>
         </w:tc>
@@ -3917,6 +3918,7 @@
                 <w:rFonts w:ascii="Arial" w:hAnsi="Arial"/>
                 <w:sz w:val="16"/>
               </w:rPr>
+              <w:t>19-10-2026</w:t>
             </w:r>
           </w:p>
         </w:tc>
@@ -3933,7 +3935,7 @@
                 <w:rFonts w:ascii="Arial" w:hAnsi="Arial"/>
                 <w:sz w:val="16"/>
               </w:rPr>
-              <w:t>1.1.04 IVA crédito fiscal</w:t>
+              <w:t>Factura de compra N°204: Hojas de boldo (IVA retenido)</w:t>
             </w:r>
           </w:p>
         </w:tc>
@@ -3950,7 +3952,6 @@
                 <w:rFonts w:ascii="Arial" w:hAnsi="Arial"/>
                 <w:sz w:val="16"/>
               </w:rPr>
-              <w:t>152.000</w:t>
             </w:r>
           </w:p>
         </w:tc>
@@ -4017,7 +4018,7 @@
                 <w:rFonts w:ascii="Arial" w:hAnsi="Arial"/>
                 <w:sz w:val="16"/>
               </w:rPr>
-              <w:t xml:space="preserve">      2.1.01 Proveedores</w:t>
+              <w:t>1.1.13 Inventario mercaderías</w:t>
             </w:r>
           </w:p>
         </w:tc>
@@ -4034,6 +4035,7 @@
                 <w:rFonts w:ascii="Arial" w:hAnsi="Arial"/>
                 <w:sz w:val="16"/>
               </w:rPr>
+              <w:t>595.000</w:t>
             </w:r>
           </w:p>
         </w:tc>
@@ -4050,7 +4052,6 @@
                 <w:rFonts w:ascii="Arial" w:hAnsi="Arial"/>
                 <w:sz w:val="16"/>
               </w:rPr>
-              <w:t>800.000</w:t>
             </w:r>
           </w:p>
         </w:tc>
@@ -4101,7 +4102,7 @@
                 <w:rFonts w:ascii="Arial" w:hAnsi="Arial"/>
                 <w:sz w:val="16"/>
               </w:rPr>
-              <w:t xml:space="preserve">      2.1.09 IVA retenido por pagar</w:t>
+              <w:t xml:space="preserve">      2.1.01 Proveedores</w:t>
             </w:r>
           </w:p>
         </w:tc>
@@ -4134,7 +4135,7 @@
                 <w:rFonts w:ascii="Arial" w:hAnsi="Arial"/>
                 <w:sz w:val="16"/>
               </w:rPr>
-              <w:t>152.000</w:t>
+              <w:t>500.000</w:t>
             </w:r>
           </w:p>
         </w:tc>
@@ -4153,7 +4154,6 @@
                 <w:rFonts w:ascii="Arial" w:hAnsi="Arial"/>
                 <w:sz w:val="16"/>
               </w:rPr>
-              <w:t>4</w:t>
             </w:r>
           </w:p>
         </w:tc>
@@ -4170,7 +4170,6 @@
                 <w:rFonts w:ascii="Arial" w:hAnsi="Arial"/>
                 <w:sz w:val="16"/>
               </w:rPr>
-              <w:t>19-10-2026</w:t>
             </w:r>
           </w:p>
         </w:tc>
@@ -4187,7 +4186,7 @@
                 <w:rFonts w:ascii="Arial" w:hAnsi="Arial"/>
                 <w:sz w:val="16"/>
               </w:rPr>
-              <w:t>Factura de compra N°204: Hojas de boldo (IVA retenido)</w:t>
+              <w:t xml:space="preserve">      2.1.09 IVA retenido por pagar</w:t>
             </w:r>
           </w:p>
         </w:tc>
@@ -4220,6 +4219,7 @@
                 <w:rFonts w:ascii="Arial" w:hAnsi="Arial"/>
                 <w:sz w:val="16"/>
               </w:rPr>
+              <w:t>95.000</w:t>
             </w:r>
           </w:p>
         </w:tc>
@@ -4238,6 +4238,7 @@
                 <w:rFonts w:ascii="Arial" w:hAnsi="Arial"/>
                 <w:sz w:val="16"/>
               </w:rPr>
+              <w:t>5</w:t>
             </w:r>
           </w:p>
         </w:tc>
@@ -4254,6 +4255,7 @@
                 <w:rFonts w:ascii="Arial" w:hAnsi="Arial"/>
                 <w:sz w:val="16"/>
               </w:rPr>
+              <w:t>26-10-2026</w:t>
             </w:r>
           </w:p>
         </w:tc>
@@ -4270,7 +4272,7 @@
                 <w:rFonts w:ascii="Arial" w:hAnsi="Arial"/>
                 <w:sz w:val="16"/>
               </w:rPr>
-              <w:t>1.1.13 Inventario mercaderías</w:t>
+              <w:t>Factura de compra N°205: Frutos de espino (IVA retenido)</w:t>
             </w:r>
           </w:p>
         </w:tc>
@@ -4287,7 +4289,6 @@
                 <w:rFonts w:ascii="Arial" w:hAnsi="Arial"/>
                 <w:sz w:val="16"/>
               </w:rPr>
-              <w:t>500.000</w:t>
             </w:r>
           </w:p>
         </w:tc>
@@ -4354,7 +4355,7 @@
                 <w:rFonts w:ascii="Arial" w:hAnsi="Arial"/>
                 <w:sz w:val="16"/>
               </w:rPr>
-              <w:t>1.1.04 IVA crédito fiscal</w:t>
+              <w:t>1.1.13 Inventario mercaderías</w:t>
             </w:r>
           </w:p>
         </w:tc>
@@ -4371,7 +4372,7 @@
                 <w:rFonts w:ascii="Arial" w:hAnsi="Arial"/>
                 <w:sz w:val="16"/>
               </w:rPr>
-              <w:t>95.000</w:t>
+              <w:t>1.606.500</w:t>
             </w:r>
           </w:p>
         </w:tc>
@@ -4471,7 +4472,7 @@
                 <w:rFonts w:ascii="Arial" w:hAnsi="Arial"/>
                 <w:sz w:val="16"/>
               </w:rPr>
-              <w:t>500.000</w:t>
+              <w:t>1.350.000</w:t>
             </w:r>
           </w:p>
         </w:tc>
@@ -4555,7 +4556,7 @@
                 <w:rFonts w:ascii="Arial" w:hAnsi="Arial"/>
                 <w:sz w:val="16"/>
               </w:rPr>
-              <w:t>95.000</w:t>
+              <w:t>256.500</w:t>
             </w:r>
           </w:p>
         </w:tc>
@@ -4574,7 +4575,7 @@
                 <w:rFonts w:ascii="Arial" w:hAnsi="Arial"/>
                 <w:sz w:val="16"/>
               </w:rPr>
-              <w:t>5</w:t>
+              <w:t>6</w:t>
             </w:r>
           </w:p>
         </w:tc>
@@ -4591,7 +4592,7 @@
                 <w:rFonts w:ascii="Arial" w:hAnsi="Arial"/>
                 <w:sz w:val="16"/>
               </w:rPr>
-              <w:t>26-10-2026</w:t>
+              <w:t>05-10-2026</w:t>
             </w:r>
           </w:p>
         </w:tc>
@@ -4608,7 +4609,7 @@
                 <w:rFonts w:ascii="Arial" w:hAnsi="Arial"/>
                 <w:sz w:val="16"/>
               </w:rPr>
-              <w:t>Factura de compra N°205: Frutos de espino (IVA retenido)</w:t>
+              <w:t>Factura de venta N°101 a Exportadora Andes SpA</w:t>
             </w:r>
           </w:p>
         </w:tc>
@@ -4691,7 +4692,7 @@
                 <w:rFonts w:ascii="Arial" w:hAnsi="Arial"/>
                 <w:sz w:val="16"/>
               </w:rPr>
-              <w:t>1.1.13 Inventario mercaderías</w:t>
+              <w:t>1.1.03 Clientes</w:t>
             </w:r>
           </w:p>
         </w:tc>
@@ -4708,7 +4709,7 @@
                 <w:rFonts w:ascii="Arial" w:hAnsi="Arial"/>
                 <w:sz w:val="16"/>
               </w:rPr>
-              <w:t>1.350.000</w:t>
+              <w:t>2.261.000</w:t>
             </w:r>
           </w:p>
         </w:tc>
@@ -4775,7 +4776,7 @@
                 <w:rFonts w:ascii="Arial" w:hAnsi="Arial"/>
                 <w:sz w:val="16"/>
               </w:rPr>
-              <w:t>1.1.04 IVA crédito fiscal</w:t>
+              <w:t xml:space="preserve">      4.1.01 Ventas</w:t>
             </w:r>
           </w:p>
         </w:tc>
@@ -4792,7 +4793,6 @@
                 <w:rFonts w:ascii="Arial" w:hAnsi="Arial"/>
                 <w:sz w:val="16"/>
               </w:rPr>
-              <w:t>256.500</w:t>
             </w:r>
           </w:p>
         </w:tc>
@@ -4809,6 +4809,7 @@
                 <w:rFonts w:ascii="Arial" w:hAnsi="Arial"/>
                 <w:sz w:val="16"/>
               </w:rPr>
+              <w:t>1.900.000</w:t>
             </w:r>
           </w:p>
         </w:tc>
@@ -4859,7 +4860,7 @@
                 <w:rFonts w:ascii="Arial" w:hAnsi="Arial"/>
                 <w:sz w:val="16"/>
               </w:rPr>
-              <w:t xml:space="preserve">      2.1.01 Proveedores</w:t>
+              <w:t xml:space="preserve">      2.1.02 IVA débito fiscal</w:t>
             </w:r>
           </w:p>
         </w:tc>
@@ -4892,7 +4893,7 @@
                 <w:rFonts w:ascii="Arial" w:hAnsi="Arial"/>
                 <w:sz w:val="16"/>
               </w:rPr>
-              <w:t>1.350.000</w:t>
+              <w:t>361.000</w:t>
             </w:r>
           </w:p>
         </w:tc>
@@ -4911,6 +4912,7 @@
                 <w:rFonts w:ascii="Arial" w:hAnsi="Arial"/>
                 <w:sz w:val="16"/>
               </w:rPr>
+              <w:t>7</w:t>
             </w:r>
           </w:p>
         </w:tc>
@@ -4927,6 +4929,7 @@
                 <w:rFonts w:ascii="Arial" w:hAnsi="Arial"/>
                 <w:sz w:val="16"/>
               </w:rPr>
+              <w:t>09-10-2026</w:t>
             </w:r>
           </w:p>
         </w:tc>
@@ -4943,7 +4946,7 @@
                 <w:rFonts w:ascii="Arial" w:hAnsi="Arial"/>
                 <w:sz w:val="16"/>
               </w:rPr>
-              <w:t xml:space="preserve">      2.1.09 IVA retenido por pagar</w:t>
+              <w:t>Factura de venta N°102 a Agroindustrial Sur Ltda.</w:t>
             </w:r>
           </w:p>
         </w:tc>
@@ -4976,7 +4979,6 @@
                 <w:rFonts w:ascii="Arial" w:hAnsi="Arial"/>
                 <w:sz w:val="16"/>
               </w:rPr>
-              <w:t>256.500</w:t>
             </w:r>
           </w:p>
         </w:tc>
@@ -4995,7 +4997,6 @@
                 <w:rFonts w:ascii="Arial" w:hAnsi="Arial"/>
                 <w:sz w:val="16"/>
               </w:rPr>
-              <w:t>6</w:t>
             </w:r>
           </w:p>
         </w:tc>
@@ -5012,7 +5013,6 @@
                 <w:rFonts w:ascii="Arial" w:hAnsi="Arial"/>
                 <w:sz w:val="16"/>
               </w:rPr>
-              <w:t>05-10-2026</w:t>
             </w:r>
           </w:p>
         </w:tc>
@@ -5029,7 +5029,7 @@
                 <w:rFonts w:ascii="Arial" w:hAnsi="Arial"/>
                 <w:sz w:val="16"/>
               </w:rPr>
-              <w:t>Factura de venta N°101 a Exportadora Andes SpA</w:t>
+              <w:t>1.1.03 Clientes</w:t>
             </w:r>
           </w:p>
         </w:tc>
@@ -5046,6 +5046,7 @@
                 <w:rFonts w:ascii="Arial" w:hAnsi="Arial"/>
                 <w:sz w:val="16"/>
               </w:rPr>
+              <w:t>1.785.000</w:t>
             </w:r>
           </w:p>
         </w:tc>
@@ -5112,7 +5113,7 @@
                 <w:rFonts w:ascii="Arial" w:hAnsi="Arial"/>
                 <w:sz w:val="16"/>
               </w:rPr>
-              <w:t>1.1.03 Clientes</w:t>
+              <w:t xml:space="preserve">      4.1.01 Ventas</w:t>
             </w:r>
           </w:p>
         </w:tc>
@@ -5129,7 +5130,6 @@
                 <w:rFonts w:ascii="Arial" w:hAnsi="Arial"/>
                 <w:sz w:val="16"/>
               </w:rPr>
-              <w:t>2.261.000</w:t>
             </w:r>
           </w:p>
         </w:tc>
@@ -5146,6 +5146,7 @@
                 <w:rFonts w:ascii="Arial" w:hAnsi="Arial"/>
                 <w:sz w:val="16"/>
               </w:rPr>
+              <w:t>1.500.000</w:t>
             </w:r>
           </w:p>
         </w:tc>
@@ -5196,7 +5197,7 @@
                 <w:rFonts w:ascii="Arial" w:hAnsi="Arial"/>
                 <w:sz w:val="16"/>
               </w:rPr>
-              <w:t xml:space="preserve">      4.1.01 Ventas</w:t>
+              <w:t xml:space="preserve">      2.1.02 IVA débito fiscal</w:t>
             </w:r>
           </w:p>
         </w:tc>
@@ -5229,7 +5230,7 @@
                 <w:rFonts w:ascii="Arial" w:hAnsi="Arial"/>
                 <w:sz w:val="16"/>
               </w:rPr>
-              <w:t>1.900.000</w:t>
+              <w:t>285.000</w:t>
             </w:r>
           </w:p>
         </w:tc>
@@ -5248,6 +5249,7 @@
                 <w:rFonts w:ascii="Arial" w:hAnsi="Arial"/>
                 <w:sz w:val="16"/>
               </w:rPr>
+              <w:t>8</w:t>
             </w:r>
           </w:p>
         </w:tc>
@@ -5264,6 +5266,7 @@
                 <w:rFonts w:ascii="Arial" w:hAnsi="Arial"/>
                 <w:sz w:val="16"/>
               </w:rPr>
+              <w:t>14-10-2026</w:t>
             </w:r>
           </w:p>
         </w:tc>
@@ -5280,7 +5283,7 @@
                 <w:rFonts w:ascii="Arial" w:hAnsi="Arial"/>
                 <w:sz w:val="16"/>
               </w:rPr>
-              <w:t xml:space="preserve">      2.1.02 IVA débito fiscal</w:t>
+              <w:t>Factura de venta N°103 a Hierbas del Valle S.A.</w:t>
             </w:r>
           </w:p>
         </w:tc>
@@ -5313,7 +5316,6 @@
                 <w:rFonts w:ascii="Arial" w:hAnsi="Arial"/>
                 <w:sz w:val="16"/>
               </w:rPr>
-              <w:t>361.000</w:t>
             </w:r>
           </w:p>
         </w:tc>
@@ -5332,7 +5334,6 @@
                 <w:rFonts w:ascii="Arial" w:hAnsi="Arial"/>
                 <w:sz w:val="16"/>
               </w:rPr>
-              <w:t>7</w:t>
             </w:r>
           </w:p>
         </w:tc>
@@ -5349,7 +5350,6 @@
                 <w:rFonts w:ascii="Arial" w:hAnsi="Arial"/>
                 <w:sz w:val="16"/>
               </w:rPr>
-              <w:t>09-10-2026</w:t>
             </w:r>
           </w:p>
         </w:tc>
@@ -5366,7 +5366,7 @@
                 <w:rFonts w:ascii="Arial" w:hAnsi="Arial"/>
                 <w:sz w:val="16"/>
               </w:rPr>
-              <w:t>Factura de venta N°102 a Agroindustrial Sur Ltda.</w:t>
+              <w:t>1.1.03 Clientes</w:t>
             </w:r>
           </w:p>
         </w:tc>
@@ -5383,6 +5383,7 @@
                 <w:rFonts w:ascii="Arial" w:hAnsi="Arial"/>
                 <w:sz w:val="16"/>
               </w:rPr>
+              <w:t>1.666.000</w:t>
             </w:r>
           </w:p>
         </w:tc>
@@ -5449,7 +5450,7 @@
                 <w:rFonts w:ascii="Arial" w:hAnsi="Arial"/>
                 <w:sz w:val="16"/>
               </w:rPr>
-              <w:t>1.1.03 Clientes</w:t>
+              <w:t xml:space="preserve">      4.1.01 Ventas</w:t>
             </w:r>
           </w:p>
         </w:tc>
@@ -5466,7 +5467,6 @@
                 <w:rFonts w:ascii="Arial" w:hAnsi="Arial"/>
                 <w:sz w:val="16"/>
               </w:rPr>
-              <w:t>1.785.000</w:t>
             </w:r>
           </w:p>
         </w:tc>
@@ -5483,6 +5483,7 @@
                 <w:rFonts w:ascii="Arial" w:hAnsi="Arial"/>
                 <w:sz w:val="16"/>
               </w:rPr>
+              <w:t>1.400.000</w:t>
             </w:r>
           </w:p>
         </w:tc>
@@ -5533,7 +5534,7 @@
                 <w:rFonts w:ascii="Arial" w:hAnsi="Arial"/>
                 <w:sz w:val="16"/>
               </w:rPr>
-              <w:t xml:space="preserve">      4.1.01 Ventas</w:t>
+              <w:t xml:space="preserve">      2.1.02 IVA débito fiscal</w:t>
             </w:r>
           </w:p>
         </w:tc>
@@ -5566,7 +5567,7 @@
                 <w:rFonts w:ascii="Arial" w:hAnsi="Arial"/>
                 <w:sz w:val="16"/>
               </w:rPr>
-              <w:t>1.500.000</w:t>
+              <w:t>266.000</w:t>
             </w:r>
           </w:p>
         </w:tc>
@@ -5585,6 +5586,7 @@
                 <w:rFonts w:ascii="Arial" w:hAnsi="Arial"/>
                 <w:sz w:val="16"/>
               </w:rPr>
+              <w:t>9</w:t>
             </w:r>
           </w:p>
         </w:tc>
@@ -5601,6 +5603,7 @@
                 <w:rFonts w:ascii="Arial" w:hAnsi="Arial"/>
                 <w:sz w:val="16"/>
               </w:rPr>
+              <w:t>21-10-2026</w:t>
             </w:r>
           </w:p>
         </w:tc>
@@ -5617,7 +5620,7 @@
                 <w:rFonts w:ascii="Arial" w:hAnsi="Arial"/>
                 <w:sz w:val="16"/>
               </w:rPr>
-              <w:t xml:space="preserve">      2.1.02 IVA débito fiscal</w:t>
+              <w:t>Factura de venta N°104 a Comercial Maule SpA</w:t>
             </w:r>
           </w:p>
         </w:tc>
@@ -5650,7 +5653,6 @@
                 <w:rFonts w:ascii="Arial" w:hAnsi="Arial"/>
                 <w:sz w:val="16"/>
               </w:rPr>
-              <w:t>285.000</w:t>
             </w:r>
           </w:p>
         </w:tc>
@@ -5669,7 +5671,6 @@
                 <w:rFonts w:ascii="Arial" w:hAnsi="Arial"/>
                 <w:sz w:val="16"/>
               </w:rPr>
-              <w:t>8</w:t>
             </w:r>
           </w:p>
         </w:tc>
@@ -5686,7 +5687,6 @@
                 <w:rFonts w:ascii="Arial" w:hAnsi="Arial"/>
                 <w:sz w:val="16"/>
               </w:rPr>
-              <w:t>14-10-2026</w:t>
             </w:r>
           </w:p>
         </w:tc>
@@ -5703,7 +5703,7 @@
                 <w:rFonts w:ascii="Arial" w:hAnsi="Arial"/>
                 <w:sz w:val="16"/>
               </w:rPr>
-              <w:t>Factura de venta N°103 a Hierbas del Valle S.A.</w:t>
+              <w:t>1.1.03 Clientes</w:t>
             </w:r>
           </w:p>
         </w:tc>
@@ -5720,6 +5720,7 @@
                 <w:rFonts w:ascii="Arial" w:hAnsi="Arial"/>
                 <w:sz w:val="16"/>
               </w:rPr>
+              <w:t>1.071.000</w:t>
             </w:r>
           </w:p>
         </w:tc>
@@ -5786,7 +5787,7 @@
                 <w:rFonts w:ascii="Arial" w:hAnsi="Arial"/>
                 <w:sz w:val="16"/>
               </w:rPr>
-              <w:t>1.1.03 Clientes</w:t>
+              <w:t xml:space="preserve">      4.1.01 Ventas</w:t>
             </w:r>
           </w:p>
         </w:tc>
@@ -5803,7 +5804,6 @@
                 <w:rFonts w:ascii="Arial" w:hAnsi="Arial"/>
                 <w:sz w:val="16"/>
               </w:rPr>
-              <w:t>1.666.000</w:t>
             </w:r>
           </w:p>
         </w:tc>
@@ -5820,6 +5820,7 @@
                 <w:rFonts w:ascii="Arial" w:hAnsi="Arial"/>
                 <w:sz w:val="16"/>
               </w:rPr>
+              <w:t>900.000</w:t>
             </w:r>
           </w:p>
         </w:tc>
@@ -5870,7 +5871,7 @@
                 <w:rFonts w:ascii="Arial" w:hAnsi="Arial"/>
                 <w:sz w:val="16"/>
               </w:rPr>
-              <w:t xml:space="preserve">      4.1.01 Ventas</w:t>
+              <w:t xml:space="preserve">      2.1.02 IVA débito fiscal</w:t>
             </w:r>
           </w:p>
         </w:tc>
@@ -5903,7 +5904,7 @@
                 <w:rFonts w:ascii="Arial" w:hAnsi="Arial"/>
                 <w:sz w:val="16"/>
               </w:rPr>
-              <w:t>1.400.000</w:t>
+              <w:t>171.000</w:t>
             </w:r>
           </w:p>
         </w:tc>
@@ -5922,6 +5923,7 @@
                 <w:rFonts w:ascii="Arial" w:hAnsi="Arial"/>
                 <w:sz w:val="16"/>
               </w:rPr>
+              <w:t>10</w:t>
             </w:r>
           </w:p>
         </w:tc>
@@ -5938,6 +5940,7 @@
                 <w:rFonts w:ascii="Arial" w:hAnsi="Arial"/>
                 <w:sz w:val="16"/>
               </w:rPr>
+              <w:t>28-10-2026</w:t>
             </w:r>
           </w:p>
         </w:tc>
@@ -5954,7 +5957,7 @@
                 <w:rFonts w:ascii="Arial" w:hAnsi="Arial"/>
                 <w:sz w:val="16"/>
               </w:rPr>
-              <w:t xml:space="preserve">      2.1.02 IVA débito fiscal</w:t>
+              <w:t>Factura de venta N°105 a Distribuidora Bío Bío Ltda.</w:t>
             </w:r>
           </w:p>
         </w:tc>
@@ -5987,7 +5990,6 @@
                 <w:rFonts w:ascii="Arial" w:hAnsi="Arial"/>
                 <w:sz w:val="16"/>
               </w:rPr>
-              <w:t>266.000</w:t>
             </w:r>
           </w:p>
         </w:tc>
@@ -6006,7 +6008,6 @@
                 <w:rFonts w:ascii="Arial" w:hAnsi="Arial"/>
                 <w:sz w:val="16"/>
               </w:rPr>
-              <w:t>9</w:t>
             </w:r>
           </w:p>
         </w:tc>
@@ -6023,7 +6024,6 @@
                 <w:rFonts w:ascii="Arial" w:hAnsi="Arial"/>
                 <w:sz w:val="16"/>
               </w:rPr>
-              <w:t>21-10-2026</w:t>
             </w:r>
           </w:p>
         </w:tc>
@@ -6040,7 +6040,7 @@
                 <w:rFonts w:ascii="Arial" w:hAnsi="Arial"/>
                 <w:sz w:val="16"/>
               </w:rPr>
-              <w:t>Factura de venta N°104 a Comercial Maule SpA</w:t>
+              <w:t>1.1.03 Clientes</w:t>
             </w:r>
           </w:p>
         </w:tc>
@@ -6057,6 +6057,7 @@
                 <w:rFonts w:ascii="Arial" w:hAnsi="Arial"/>
                 <w:sz w:val="16"/>
               </w:rPr>
+              <w:t>1.547.000</w:t>
             </w:r>
           </w:p>
         </w:tc>
@@ -6123,7 +6124,7 @@
                 <w:rFonts w:ascii="Arial" w:hAnsi="Arial"/>
                 <w:sz w:val="16"/>
               </w:rPr>
-              <w:t>1.1.03 Clientes</w:t>
+              <w:t xml:space="preserve">      4.1.01 Ventas</w:t>
             </w:r>
           </w:p>
         </w:tc>
@@ -6140,7 +6141,6 @@
                 <w:rFonts w:ascii="Arial" w:hAnsi="Arial"/>
                 <w:sz w:val="16"/>
               </w:rPr>
-              <w:t>1.071.000</w:t>
             </w:r>
           </w:p>
         </w:tc>
@@ -6157,6 +6157,7 @@
                 <w:rFonts w:ascii="Arial" w:hAnsi="Arial"/>
                 <w:sz w:val="16"/>
               </w:rPr>
+              <w:t>1.300.000</w:t>
             </w:r>
           </w:p>
         </w:tc>
@@ -6207,7 +6208,7 @@
                 <w:rFonts w:ascii="Arial" w:hAnsi="Arial"/>
                 <w:sz w:val="16"/>
               </w:rPr>
-              <w:t xml:space="preserve">      4.1.01 Ventas</w:t>
+              <w:t xml:space="preserve">      2.1.02 IVA débito fiscal</w:t>
             </w:r>
           </w:p>
         </w:tc>
@@ -6240,7 +6241,7 @@
                 <w:rFonts w:ascii="Arial" w:hAnsi="Arial"/>
                 <w:sz w:val="16"/>
               </w:rPr>
-              <w:t>900.000</w:t>
+              <w:t>247.000</w:t>
             </w:r>
           </w:p>
         </w:tc>
@@ -6259,6 +6260,7 @@
                 <w:rFonts w:ascii="Arial" w:hAnsi="Arial"/>
                 <w:sz w:val="16"/>
               </w:rPr>
+              <w:t>11</w:t>
             </w:r>
           </w:p>
         </w:tc>
@@ -6275,6 +6277,7 @@
                 <w:rFonts w:ascii="Arial" w:hAnsi="Arial"/>
                 <w:sz w:val="16"/>
               </w:rPr>
+              <w:t>31-10-2026</w:t>
             </w:r>
           </w:p>
         </w:tc>
@@ -6291,7 +6294,7 @@
                 <w:rFonts w:ascii="Arial" w:hAnsi="Arial"/>
                 <w:sz w:val="16"/>
               </w:rPr>
-              <w:t xml:space="preserve">      2.1.02 IVA débito fiscal</w:t>
+              <w:t>Costo de las ventas del mes</w:t>
             </w:r>
           </w:p>
         </w:tc>
@@ -6324,7 +6327,6 @@
                 <w:rFonts w:ascii="Arial" w:hAnsi="Arial"/>
                 <w:sz w:val="16"/>
               </w:rPr>
-              <w:t>171.000</w:t>
             </w:r>
           </w:p>
         </w:tc>
@@ -6343,7 +6345,6 @@
                 <w:rFonts w:ascii="Arial" w:hAnsi="Arial"/>
                 <w:sz w:val="16"/>
               </w:rPr>
-              <w:t>10</w:t>
             </w:r>
           </w:p>
         </w:tc>
@@ -6360,7 +6361,6 @@
                 <w:rFonts w:ascii="Arial" w:hAnsi="Arial"/>
                 <w:sz w:val="16"/>
               </w:rPr>
-              <w:t>28-10-2026</w:t>
             </w:r>
           </w:p>
         </w:tc>
@@ -6377,7 +6377,7 @@
                 <w:rFonts w:ascii="Arial" w:hAnsi="Arial"/>
                 <w:sz w:val="16"/>
               </w:rPr>
-              <w:t>Factura de venta N°105 a Distribuidora Bío Bío Ltda.</w:t>
+              <w:t>5.1.01 Costo de ventas</w:t>
             </w:r>
           </w:p>
         </w:tc>
@@ -6394,6 +6394,7 @@
                 <w:rFonts w:ascii="Arial" w:hAnsi="Arial"/>
                 <w:sz w:val="16"/>
               </w:rPr>
+              <w:t>5.000.000</w:t>
             </w:r>
           </w:p>
         </w:tc>
@@ -6460,7 +6461,7 @@
                 <w:rFonts w:ascii="Arial" w:hAnsi="Arial"/>
                 <w:sz w:val="16"/>
               </w:rPr>
-              <w:t>1.1.03 Clientes</w:t>
+              <w:t xml:space="preserve">      1.1.13 Inventario mercaderías</w:t>
             </w:r>
           </w:p>
         </w:tc>
@@ -6477,7 +6478,6 @@
                 <w:rFonts w:ascii="Arial" w:hAnsi="Arial"/>
                 <w:sz w:val="16"/>
               </w:rPr>
-              <w:t>1.547.000</w:t>
             </w:r>
           </w:p>
         </w:tc>
@@ -6494,6 +6494,7 @@
                 <w:rFonts w:ascii="Arial" w:hAnsi="Arial"/>
                 <w:sz w:val="16"/>
               </w:rPr>
+              <w:t>5.000.000</w:t>
             </w:r>
           </w:p>
         </w:tc>
@@ -6512,6 +6513,7 @@
                 <w:rFonts w:ascii="Arial" w:hAnsi="Arial"/>
                 <w:sz w:val="16"/>
               </w:rPr>
+              <w:t>12</w:t>
             </w:r>
           </w:p>
         </w:tc>
@@ -6528,6 +6530,7 @@
                 <w:rFonts w:ascii="Arial" w:hAnsi="Arial"/>
                 <w:sz w:val="16"/>
               </w:rPr>
+              <w:t>31-10-2026</w:t>
             </w:r>
           </w:p>
         </w:tc>
@@ -6544,7 +6547,7 @@
                 <w:rFonts w:ascii="Arial" w:hAnsi="Arial"/>
                 <w:sz w:val="16"/>
               </w:rPr>
-              <w:t xml:space="preserve">      4.1.01 Ventas</w:t>
+              <w:t>Pago a los proveedores</w:t>
             </w:r>
           </w:p>
         </w:tc>
@@ -6577,7 +6580,6 @@
                 <w:rFonts w:ascii="Arial" w:hAnsi="Arial"/>
                 <w:sz w:val="16"/>
               </w:rPr>
-              <w:t>1.300.000</w:t>
             </w:r>
           </w:p>
         </w:tc>
@@ -6628,7 +6630,7 @@
                 <w:rFonts w:ascii="Arial" w:hAnsi="Arial"/>
                 <w:sz w:val="16"/>
               </w:rPr>
-              <w:t xml:space="preserve">      2.1.02 IVA débito fiscal</w:t>
+              <w:t>2.1.01 Proveedores</w:t>
             </w:r>
           </w:p>
         </w:tc>
@@ -6645,6 +6647,7 @@
                 <w:rFonts w:ascii="Arial" w:hAnsi="Arial"/>
                 <w:sz w:val="16"/>
               </w:rPr>
+              <w:t>5.650.000</w:t>
             </w:r>
           </w:p>
         </w:tc>
@@ -6661,7 +6664,6 @@
                 <w:rFonts w:ascii="Arial" w:hAnsi="Arial"/>
                 <w:sz w:val="16"/>
               </w:rPr>
-              <w:t>247.000</w:t>
             </w:r>
           </w:p>
         </w:tc>
@@ -6680,7 +6682,6 @@
                 <w:rFonts w:ascii="Arial" w:hAnsi="Arial"/>
                 <w:sz w:val="16"/>
               </w:rPr>
-              <w:t>11</w:t>
             </w:r>
           </w:p>
         </w:tc>
@@ -6697,7 +6698,6 @@
                 <w:rFonts w:ascii="Arial" w:hAnsi="Arial"/>
                 <w:sz w:val="16"/>
               </w:rPr>
-              <w:t>31-10-2026</w:t>
             </w:r>
           </w:p>
         </w:tc>
@@ -6714,7 +6714,7 @@
                 <w:rFonts w:ascii="Arial" w:hAnsi="Arial"/>
                 <w:sz w:val="16"/>
               </w:rPr>
-              <w:t>Costo de las ventas del mes</w:t>
+              <w:t xml:space="preserve">      1.1.02 Banco</w:t>
             </w:r>
           </w:p>
         </w:tc>
@@ -6747,6 +6747,7 @@
                 <w:rFonts w:ascii="Arial" w:hAnsi="Arial"/>
                 <w:sz w:val="16"/>
               </w:rPr>
+              <w:t>5.650.000</w:t>
             </w:r>
           </w:p>
         </w:tc>
@@ -6765,6 +6766,7 @@
                 <w:rFonts w:ascii="Arial" w:hAnsi="Arial"/>
                 <w:sz w:val="16"/>
               </w:rPr>
+              <w:t>13</w:t>
             </w:r>
           </w:p>
         </w:tc>
@@ -6781,6 +6783,7 @@
                 <w:rFonts w:ascii="Arial" w:hAnsi="Arial"/>
                 <w:sz w:val="16"/>
               </w:rPr>
+              <w:t>12-11-2026</w:t>
             </w:r>
           </w:p>
         </w:tc>
@@ -6797,7 +6800,7 @@
                 <w:rFonts w:ascii="Arial" w:hAnsi="Arial"/>
                 <w:sz w:val="16"/>
               </w:rPr>
-              <w:t>5.1.01 Costo de ventas</w:t>
+              <w:t>F29: débito, IVA retenido y PPM</w:t>
             </w:r>
           </w:p>
         </w:tc>
@@ -6814,7 +6817,6 @@
                 <w:rFonts w:ascii="Arial" w:hAnsi="Arial"/>
                 <w:sz w:val="16"/>
               </w:rPr>
-              <w:t>5.000.000</w:t>
             </w:r>
           </w:p>
         </w:tc>
@@ -6881,7 +6883,7 @@
                 <w:rFonts w:ascii="Arial" w:hAnsi="Arial"/>
                 <w:sz w:val="16"/>
               </w:rPr>
-              <w:t xml:space="preserve">      1.1.13 Inventario mercaderías</w:t>
+              <w:t>2.1.02 IVA débito fiscal</w:t>
             </w:r>
           </w:p>
         </w:tc>
@@ -6898,6 +6900,7 @@
                 <w:rFonts w:ascii="Arial" w:hAnsi="Arial"/>
                 <w:sz w:val="16"/>
               </w:rPr>
+              <w:t>1.330.000</w:t>
             </w:r>
           </w:p>
         </w:tc>
@@ -6914,7 +6917,6 @@
                 <w:rFonts w:ascii="Arial" w:hAnsi="Arial"/>
                 <w:sz w:val="16"/>
               </w:rPr>
-              <w:t>5.000.000</w:t>
             </w:r>
           </w:p>
         </w:tc>
@@ -6933,7 +6935,6 @@
                 <w:rFonts w:ascii="Arial" w:hAnsi="Arial"/>
                 <w:sz w:val="16"/>
               </w:rPr>
-              <w:t>12</w:t>
             </w:r>
           </w:p>
         </w:tc>
@@ -6950,7 +6951,6 @@
                 <w:rFonts w:ascii="Arial" w:hAnsi="Arial"/>
                 <w:sz w:val="16"/>
               </w:rPr>
-              <w:t>31-10-2026</w:t>
             </w:r>
           </w:p>
         </w:tc>
@@ -6967,7 +6967,7 @@
                 <w:rFonts w:ascii="Arial" w:hAnsi="Arial"/>
                 <w:sz w:val="16"/>
               </w:rPr>
-              <w:t>Pago a los proveedores</w:t>
+              <w:t>2.1.09 IVA retenido por pagar</w:t>
             </w:r>
           </w:p>
         </w:tc>
@@ -6984,6 +6984,7 @@
                 <w:rFonts w:ascii="Arial" w:hAnsi="Arial"/>
                 <w:sz w:val="16"/>
               </w:rPr>
+              <w:t>1.073.500</w:t>
             </w:r>
           </w:p>
         </w:tc>
@@ -7050,7 +7051,7 @@
                 <w:rFonts w:ascii="Arial" w:hAnsi="Arial"/>
                 <w:sz w:val="16"/>
               </w:rPr>
-              <w:t>2.1.01 Proveedores</w:t>
+              <w:t>1.1.05 PPM por recuperar</w:t>
             </w:r>
           </w:p>
         </w:tc>
@@ -7067,7 +7068,7 @@
                 <w:rFonts w:ascii="Arial" w:hAnsi="Arial"/>
                 <w:sz w:val="16"/>
               </w:rPr>
-              <w:t>5.650.000</w:t>
+              <w:t>70.000</w:t>
             </w:r>
           </w:p>
         </w:tc>
@@ -7167,512 +7168,7 @@
                 <w:rFonts w:ascii="Arial" w:hAnsi="Arial"/>
                 <w:sz w:val="16"/>
               </w:rPr>
-              <w:t>5.650.000</w:t>
-            </w:r>
-          </w:p>
-        </w:tc>
-      </w:tr>
-      <w:tr>
-        <w:tc>
-          <w:tcPr>
-            <w:tcW w:type="dxa" w:w="1881"/>
-          </w:tcPr>
-          <w:p>
-            <w:pPr>
-              <w:spacing w:line="240" w:lineRule="auto"/>
-            </w:pPr>
-            <w:r>
-              <w:rPr>
-                <w:rFonts w:ascii="Arial" w:hAnsi="Arial"/>
-                <w:sz w:val="16"/>
-              </w:rPr>
-              <w:t>13</w:t>
-            </w:r>
-          </w:p>
-        </w:tc>
-        <w:tc>
-          <w:tcPr>
-            <w:tcW w:type="dxa" w:w="1881"/>
-          </w:tcPr>
-          <w:p>
-            <w:pPr>
-              <w:spacing w:line="240" w:lineRule="auto"/>
-            </w:pPr>
-            <w:r>
-              <w:rPr>
-                <w:rFonts w:ascii="Arial" w:hAnsi="Arial"/>
-                <w:sz w:val="16"/>
-              </w:rPr>
-              <w:t>12-11-2026</w:t>
-            </w:r>
-          </w:p>
-        </w:tc>
-        <w:tc>
-          <w:tcPr>
-            <w:tcW w:type="dxa" w:w="1881"/>
-          </w:tcPr>
-          <w:p>
-            <w:pPr>
-              <w:spacing w:line="240" w:lineRule="auto"/>
-            </w:pPr>
-            <w:r>
-              <w:rPr>
-                <w:rFonts w:ascii="Arial" w:hAnsi="Arial"/>
-                <w:sz w:val="16"/>
-              </w:rPr>
-              <w:t>F29: débito, IVA retenido, crédito y PPM</w:t>
-            </w:r>
-          </w:p>
-        </w:tc>
-        <w:tc>
-          <w:tcPr>
-            <w:tcW w:type="dxa" w:w="1881"/>
-          </w:tcPr>
-          <w:p>
-            <w:pPr>
-              <w:spacing w:line="240" w:lineRule="auto"/>
-            </w:pPr>
-            <w:r>
-              <w:rPr>
-                <w:rFonts w:ascii="Arial" w:hAnsi="Arial"/>
-                <w:sz w:val="16"/>
-              </w:rPr>
-            </w:r>
-          </w:p>
-        </w:tc>
-        <w:tc>
-          <w:tcPr>
-            <w:tcW w:type="dxa" w:w="1881"/>
-          </w:tcPr>
-          <w:p>
-            <w:pPr>
-              <w:spacing w:line="240" w:lineRule="auto"/>
-            </w:pPr>
-            <w:r>
-              <w:rPr>
-                <w:rFonts w:ascii="Arial" w:hAnsi="Arial"/>
-                <w:sz w:val="16"/>
-              </w:rPr>
-            </w:r>
-          </w:p>
-        </w:tc>
-      </w:tr>
-      <w:tr>
-        <w:tc>
-          <w:tcPr>
-            <w:tcW w:type="dxa" w:w="1881"/>
-          </w:tcPr>
-          <w:p>
-            <w:pPr>
-              <w:spacing w:line="240" w:lineRule="auto"/>
-            </w:pPr>
-            <w:r>
-              <w:rPr>
-                <w:rFonts w:ascii="Arial" w:hAnsi="Arial"/>
-                <w:sz w:val="16"/>
-              </w:rPr>
-            </w:r>
-          </w:p>
-        </w:tc>
-        <w:tc>
-          <w:tcPr>
-            <w:tcW w:type="dxa" w:w="1881"/>
-          </w:tcPr>
-          <w:p>
-            <w:pPr>
-              <w:spacing w:line="240" w:lineRule="auto"/>
-            </w:pPr>
-            <w:r>
-              <w:rPr>
-                <w:rFonts w:ascii="Arial" w:hAnsi="Arial"/>
-                <w:sz w:val="16"/>
-              </w:rPr>
-            </w:r>
-          </w:p>
-        </w:tc>
-        <w:tc>
-          <w:tcPr>
-            <w:tcW w:type="dxa" w:w="1881"/>
-          </w:tcPr>
-          <w:p>
-            <w:pPr>
-              <w:spacing w:line="240" w:lineRule="auto"/>
-            </w:pPr>
-            <w:r>
-              <w:rPr>
-                <w:rFonts w:ascii="Arial" w:hAnsi="Arial"/>
-                <w:sz w:val="16"/>
-              </w:rPr>
-              <w:t>2.1.02 IVA débito fiscal</w:t>
-            </w:r>
-          </w:p>
-        </w:tc>
-        <w:tc>
-          <w:tcPr>
-            <w:tcW w:type="dxa" w:w="1881"/>
-          </w:tcPr>
-          <w:p>
-            <w:pPr>
-              <w:spacing w:line="240" w:lineRule="auto"/>
-            </w:pPr>
-            <w:r>
-              <w:rPr>
-                <w:rFonts w:ascii="Arial" w:hAnsi="Arial"/>
-                <w:sz w:val="16"/>
-              </w:rPr>
-              <w:t>1.330.000</w:t>
-            </w:r>
-          </w:p>
-        </w:tc>
-        <w:tc>
-          <w:tcPr>
-            <w:tcW w:type="dxa" w:w="1881"/>
-          </w:tcPr>
-          <w:p>
-            <w:pPr>
-              <w:spacing w:line="240" w:lineRule="auto"/>
-            </w:pPr>
-            <w:r>
-              <w:rPr>
-                <w:rFonts w:ascii="Arial" w:hAnsi="Arial"/>
-                <w:sz w:val="16"/>
-              </w:rPr>
-            </w:r>
-          </w:p>
-        </w:tc>
-      </w:tr>
-      <w:tr>
-        <w:tc>
-          <w:tcPr>
-            <w:tcW w:type="dxa" w:w="1881"/>
-          </w:tcPr>
-          <w:p>
-            <w:pPr>
-              <w:spacing w:line="240" w:lineRule="auto"/>
-            </w:pPr>
-            <w:r>
-              <w:rPr>
-                <w:rFonts w:ascii="Arial" w:hAnsi="Arial"/>
-                <w:sz w:val="16"/>
-              </w:rPr>
-            </w:r>
-          </w:p>
-        </w:tc>
-        <w:tc>
-          <w:tcPr>
-            <w:tcW w:type="dxa" w:w="1881"/>
-          </w:tcPr>
-          <w:p>
-            <w:pPr>
-              <w:spacing w:line="240" w:lineRule="auto"/>
-            </w:pPr>
-            <w:r>
-              <w:rPr>
-                <w:rFonts w:ascii="Arial" w:hAnsi="Arial"/>
-                <w:sz w:val="16"/>
-              </w:rPr>
-            </w:r>
-          </w:p>
-        </w:tc>
-        <w:tc>
-          <w:tcPr>
-            <w:tcW w:type="dxa" w:w="1881"/>
-          </w:tcPr>
-          <w:p>
-            <w:pPr>
-              <w:spacing w:line="240" w:lineRule="auto"/>
-            </w:pPr>
-            <w:r>
-              <w:rPr>
-                <w:rFonts w:ascii="Arial" w:hAnsi="Arial"/>
-                <w:sz w:val="16"/>
-              </w:rPr>
-              <w:t>2.1.09 IVA retenido por pagar</w:t>
-            </w:r>
-          </w:p>
-        </w:tc>
-        <w:tc>
-          <w:tcPr>
-            <w:tcW w:type="dxa" w:w="1881"/>
-          </w:tcPr>
-          <w:p>
-            <w:pPr>
-              <w:spacing w:line="240" w:lineRule="auto"/>
-            </w:pPr>
-            <w:r>
-              <w:rPr>
-                <w:rFonts w:ascii="Arial" w:hAnsi="Arial"/>
-                <w:sz w:val="16"/>
-              </w:rPr>
-              <w:t>1.073.500</w:t>
-            </w:r>
-          </w:p>
-        </w:tc>
-        <w:tc>
-          <w:tcPr>
-            <w:tcW w:type="dxa" w:w="1881"/>
-          </w:tcPr>
-          <w:p>
-            <w:pPr>
-              <w:spacing w:line="240" w:lineRule="auto"/>
-            </w:pPr>
-            <w:r>
-              <w:rPr>
-                <w:rFonts w:ascii="Arial" w:hAnsi="Arial"/>
-                <w:sz w:val="16"/>
-              </w:rPr>
-            </w:r>
-          </w:p>
-        </w:tc>
-      </w:tr>
-      <w:tr>
-        <w:tc>
-          <w:tcPr>
-            <w:tcW w:type="dxa" w:w="1881"/>
-          </w:tcPr>
-          <w:p>
-            <w:pPr>
-              <w:spacing w:line="240" w:lineRule="auto"/>
-            </w:pPr>
-            <w:r>
-              <w:rPr>
-                <w:rFonts w:ascii="Arial" w:hAnsi="Arial"/>
-                <w:sz w:val="16"/>
-              </w:rPr>
-            </w:r>
-          </w:p>
-        </w:tc>
-        <w:tc>
-          <w:tcPr>
-            <w:tcW w:type="dxa" w:w="1881"/>
-          </w:tcPr>
-          <w:p>
-            <w:pPr>
-              <w:spacing w:line="240" w:lineRule="auto"/>
-            </w:pPr>
-            <w:r>
-              <w:rPr>
-                <w:rFonts w:ascii="Arial" w:hAnsi="Arial"/>
-                <w:sz w:val="16"/>
-              </w:rPr>
-            </w:r>
-          </w:p>
-        </w:tc>
-        <w:tc>
-          <w:tcPr>
-            <w:tcW w:type="dxa" w:w="1881"/>
-          </w:tcPr>
-          <w:p>
-            <w:pPr>
-              <w:spacing w:line="240" w:lineRule="auto"/>
-            </w:pPr>
-            <w:r>
-              <w:rPr>
-                <w:rFonts w:ascii="Arial" w:hAnsi="Arial"/>
-                <w:sz w:val="16"/>
-              </w:rPr>
-              <w:t>1.1.05 PPM por recuperar</w:t>
-            </w:r>
-          </w:p>
-        </w:tc>
-        <w:tc>
-          <w:tcPr>
-            <w:tcW w:type="dxa" w:w="1881"/>
-          </w:tcPr>
-          <w:p>
-            <w:pPr>
-              <w:spacing w:line="240" w:lineRule="auto"/>
-            </w:pPr>
-            <w:r>
-              <w:rPr>
-                <w:rFonts w:ascii="Arial" w:hAnsi="Arial"/>
-                <w:sz w:val="16"/>
-              </w:rPr>
-              <w:t>70.000</w:t>
-            </w:r>
-          </w:p>
-        </w:tc>
-        <w:tc>
-          <w:tcPr>
-            <w:tcW w:type="dxa" w:w="1881"/>
-          </w:tcPr>
-          <w:p>
-            <w:pPr>
-              <w:spacing w:line="240" w:lineRule="auto"/>
-            </w:pPr>
-            <w:r>
-              <w:rPr>
-                <w:rFonts w:ascii="Arial" w:hAnsi="Arial"/>
-                <w:sz w:val="16"/>
-              </w:rPr>
-            </w:r>
-          </w:p>
-        </w:tc>
-      </w:tr>
-      <w:tr>
-        <w:tc>
-          <w:tcPr>
-            <w:tcW w:type="dxa" w:w="1881"/>
-          </w:tcPr>
-          <w:p>
-            <w:pPr>
-              <w:spacing w:line="240" w:lineRule="auto"/>
-            </w:pPr>
-            <w:r>
-              <w:rPr>
-                <w:rFonts w:ascii="Arial" w:hAnsi="Arial"/>
-                <w:sz w:val="16"/>
-              </w:rPr>
-            </w:r>
-          </w:p>
-        </w:tc>
-        <w:tc>
-          <w:tcPr>
-            <w:tcW w:type="dxa" w:w="1881"/>
-          </w:tcPr>
-          <w:p>
-            <w:pPr>
-              <w:spacing w:line="240" w:lineRule="auto"/>
-            </w:pPr>
-            <w:r>
-              <w:rPr>
-                <w:rFonts w:ascii="Arial" w:hAnsi="Arial"/>
-                <w:sz w:val="16"/>
-              </w:rPr>
-            </w:r>
-          </w:p>
-        </w:tc>
-        <w:tc>
-          <w:tcPr>
-            <w:tcW w:type="dxa" w:w="1881"/>
-          </w:tcPr>
-          <w:p>
-            <w:pPr>
-              <w:spacing w:line="240" w:lineRule="auto"/>
-            </w:pPr>
-            <w:r>
-              <w:rPr>
-                <w:rFonts w:ascii="Arial" w:hAnsi="Arial"/>
-                <w:sz w:val="16"/>
-              </w:rPr>
-              <w:t xml:space="preserve">      1.1.04 IVA crédito fiscal</w:t>
-            </w:r>
-          </w:p>
-        </w:tc>
-        <w:tc>
-          <w:tcPr>
-            <w:tcW w:type="dxa" w:w="1881"/>
-          </w:tcPr>
-          <w:p>
-            <w:pPr>
-              <w:spacing w:line="240" w:lineRule="auto"/>
-            </w:pPr>
-            <w:r>
-              <w:rPr>
-                <w:rFonts w:ascii="Arial" w:hAnsi="Arial"/>
-                <w:sz w:val="16"/>
-              </w:rPr>
-            </w:r>
-          </w:p>
-        </w:tc>
-        <w:tc>
-          <w:tcPr>
-            <w:tcW w:type="dxa" w:w="1881"/>
-          </w:tcPr>
-          <w:p>
-            <w:pPr>
-              <w:spacing w:line="240" w:lineRule="auto"/>
-            </w:pPr>
-            <w:r>
-              <w:rPr>
-                <w:rFonts w:ascii="Arial" w:hAnsi="Arial"/>
-                <w:sz w:val="16"/>
-              </w:rPr>
-              <w:t>1.073.500</w:t>
-            </w:r>
-          </w:p>
-        </w:tc>
-      </w:tr>
-      <w:tr>
-        <w:tc>
-          <w:tcPr>
-            <w:tcW w:type="dxa" w:w="1881"/>
-          </w:tcPr>
-          <w:p>
-            <w:pPr>
-              <w:spacing w:line="240" w:lineRule="auto"/>
-            </w:pPr>
-            <w:r>
-              <w:rPr>
-                <w:rFonts w:ascii="Arial" w:hAnsi="Arial"/>
-                <w:sz w:val="16"/>
-              </w:rPr>
-            </w:r>
-          </w:p>
-        </w:tc>
-        <w:tc>
-          <w:tcPr>
-            <w:tcW w:type="dxa" w:w="1881"/>
-          </w:tcPr>
-          <w:p>
-            <w:pPr>
-              <w:spacing w:line="240" w:lineRule="auto"/>
-            </w:pPr>
-            <w:r>
-              <w:rPr>
-                <w:rFonts w:ascii="Arial" w:hAnsi="Arial"/>
-                <w:sz w:val="16"/>
-              </w:rPr>
-            </w:r>
-          </w:p>
-        </w:tc>
-        <w:tc>
-          <w:tcPr>
-            <w:tcW w:type="dxa" w:w="1881"/>
-          </w:tcPr>
-          <w:p>
-            <w:pPr>
-              <w:spacing w:line="240" w:lineRule="auto"/>
-            </w:pPr>
-            <w:r>
-              <w:rPr>
-                <w:rFonts w:ascii="Arial" w:hAnsi="Arial"/>
-                <w:sz w:val="16"/>
-              </w:rPr>
-              <w:t xml:space="preserve">      1.1.02 Banco</w:t>
-            </w:r>
-          </w:p>
-        </w:tc>
-        <w:tc>
-          <w:tcPr>
-            <w:tcW w:type="dxa" w:w="1881"/>
-          </w:tcPr>
-          <w:p>
-            <w:pPr>
-              <w:spacing w:line="240" w:lineRule="auto"/>
-            </w:pPr>
-            <w:r>
-              <w:rPr>
-                <w:rFonts w:ascii="Arial" w:hAnsi="Arial"/>
-                <w:sz w:val="16"/>
-              </w:rPr>
-            </w:r>
-          </w:p>
-        </w:tc>
-        <w:tc>
-          <w:tcPr>
-            <w:tcW w:type="dxa" w:w="1881"/>
-          </w:tcPr>
-          <w:p>
-            <w:pPr>
-              <w:spacing w:line="240" w:lineRule="auto"/>
-            </w:pPr>
-            <w:r>
-              <w:rPr>
-                <w:rFonts w:ascii="Arial" w:hAnsi="Arial"/>
-                <w:sz w:val="16"/>
-              </w:rPr>
-              <w:t>1.400.000</w:t>
+              <w:t>2.473.500</w:t>
             </w:r>
           </w:p>
         </w:tc>
@@ -7932,7 +7428,7 @@
                 <w:rFonts w:ascii="Arial" w:hAnsi="Arial"/>
                 <w:sz w:val="18"/>
               </w:rPr>
-              <w:t>25</w:t>
+              <w:t>22</w:t>
             </w:r>
           </w:p>
         </w:tc>
@@ -7949,7 +7445,7 @@
                 <w:rFonts w:ascii="Arial" w:hAnsi="Arial"/>
                 <w:sz w:val="18"/>
               </w:rPr>
-              <w:t>519 / 520</w:t>
+              <w:t>564 / 521</w:t>
             </w:r>
           </w:p>
         </w:tc>
@@ -7966,7 +7462,7 @@
                 <w:rFonts w:ascii="Arial" w:hAnsi="Arial"/>
                 <w:sz w:val="18"/>
               </w:rPr>
-              <w:t>Facturas recibidas del giro y facturas de compra emitidas (cantidad 5 / crédito)</w:t>
+              <w:t>Compras sin derecho a crédito fiscal: las 5 facturas de compra (cantidad / monto neto)</w:t>
             </w:r>
           </w:p>
         </w:tc>
@@ -7983,7 +7479,7 @@
                 <w:rFonts w:ascii="Arial" w:hAnsi="Arial"/>
                 <w:sz w:val="18"/>
               </w:rPr>
-              <w:t>1.073.500</w:t>
+              <w:t>5.650.000</w:t>
             </w:r>
           </w:p>
         </w:tc>
@@ -8053,7 +7549,7 @@
                 <w:rFonts w:ascii="Arial" w:hAnsi="Arial"/>
                 <w:sz w:val="18"/>
               </w:rPr>
-              <w:t>1.073.500</w:t>
+              <w:t>0</w:t>
             </w:r>
           </w:p>
         </w:tc>
@@ -8123,7 +7619,7 @@
                 <w:rFonts w:ascii="Arial" w:hAnsi="Arial"/>
                 <w:sz w:val="18"/>
               </w:rPr>
-              <w:t>256.500</w:t>
+              <w:t>1.330.000</w:t>
             </w:r>
           </w:p>
         </w:tc>
@@ -8402,7 +7898,7 @@
                 <w:rFonts w:ascii="Arial" w:hAnsi="Arial"/>
                 <w:sz w:val="18"/>
               </w:rPr>
-              <w:t>1.400.000</w:t>
+              <w:t>2.473.500</w:t>
             </w:r>
           </w:p>
         </w:tc>
@@ -8411,7 +7907,7 @@
     <w:p/>
     <w:p>
       <w:r>
-        <w:t>Dónde se registra el IVA retenido total o parcial. Agente retenedor (la empresa compradora): la factura de compra emitida va en la línea 25 (códigos 519 y 520, crédito fiscal) y el IVA retenido se declara en el reverso: código 39 si la retención es total y código 554 si es parcial; el código 596 suma las retenciones. Vendedor retenido: línea 5 (códigos 515 y 587) si la retención es total, y líneas 6 (código 720) y 14 (códigos 516 y 517) si es parcial. Los productos silvestres tienen retención total. El N° de línea del reverso cambia según el año del formulario ⚠️.</w:t>
+        <w:t>Dónde se registra el IVA retenido total o parcial. Agente retenedor (la empresa compradora): las facturas de compra son compras sin derecho a crédito fiscal, línea 22 (códigos 564 y 521); el IVA retenido se declara en el reverso, sección de cambio de sujeto: código 39 si la retención es total (línea 118 en las instrucciones de noviembre de 2024) y código 554 si es parcial; el código 596 suma las retenciones y ese total se agrega al total a pagar (código 91), no a los débitos. Vendedor retenido: línea 5 (códigos 515 y 587) si la retención es total, y líneas 6 (código 720) y 14 (códigos 516 y 517) si es parcial. Los productos silvestres tienen retención total. El N° de línea del reverso puede cambiar según el año del formulario: confirmar en el F29 vigente.</w:t>
       </w:r>
     </w:p>
     <w:p>
@@ -9303,7 +8799,7 @@
     </w:p>
     <w:p>
       <w:r>
-        <w:t>Con el cambio de sujeto, la empresa compradora retuvo $1.073.500 de IVA y lo pagó al fisco. Ese mismo IVA fue crédito fiscal, por lo que solo se pagó la diferencia entre el IVA de las ventas y el de las compras ($256.500), el PPM ($70.000) y el IVA retenido: $1.400.000 en total. El proveedor cobra solo el neto y no necesita emitir factura. La factura de compra respalda cada operación y permite seguir el IVA desde la compra hasta el formulario 29.</w:t>
+        <w:t>Con el cambio de sujeto, la empresa compradora retuvo $1.073.500 de IVA y lo pagó al fisco sin derecho a crédito fiscal, de modo que ese IVA forma parte del costo de las mercaderías. En el F29 pagó el IVA de sus ventas ($1.330.000), el PPM ($70.000) y el IVA retenido: $2.473.500 en total. El proveedor cobra solo el neto y no necesita emitir factura. La factura de compra respalda cada operación, y la declaración jurada F3500 informa cada mes al SII las retenciones practicadas.</w:t>
       </w:r>
     </w:p>
     <w:sectPr>

</xml_diff>

<commit_message>
Quita nombres de otras personas y la lista de curso del repositorio
Co-Authored-By: Claude Sonnet 5.5 <noreply@anthropic.com>
Claude-Session: https://claude.ai/code/session_012WV3i5CNskdg7dgJ6kwcHp
</commit_message>
<xml_diff>
--- a/trabajo_juan_castillo/cambio_sujeto_silvestres.docx
+++ b/trabajo_juan_castillo/cambio_sujeto_silvestres.docx
@@ -77,7 +77,7 @@
         <w:jc w:val="center"/>
       </w:pPr>
       <w:r>
-        <w:t>Matius Loyola</w:t>
+        <w:t>Joaquín Verdejo</w:t>
       </w:r>
     </w:p>
     <w:p>
@@ -85,7 +85,7 @@
         <w:jc w:val="center"/>
       </w:pPr>
       <w:r>
-        <w:t>Diego Quintana</w:t>
+        <w:t>[Nombre integrante 2]</w:t>
       </w:r>
     </w:p>
     <w:p>
@@ -93,7 +93,7 @@
         <w:jc w:val="center"/>
       </w:pPr>
       <w:r>
-        <w:t>Joaquín Verdejo</w:t>
+        <w:t>[Nombre integrante 3]</w:t>
       </w:r>
     </w:p>
     <w:p>

</xml_diff>